<commit_message>
open soure exploit reposotory part 2
</commit_message>
<xml_diff>
--- a/assiment.docx
+++ b/assiment.docx
@@ -53,7 +53,7 @@
                     </pic:cNvPicPr>
                   </pic:nvPicPr>
                   <pic:blipFill>
-                    <a:blip r:embed="rId8">
+                    <a:blip r:embed="rId11">
                       <a:extLst>
                         <a:ext uri="{28A0092B-C50C-407E-A947-70E740481C1C}">
                           <a14:useLocalDpi xmlns:a14="http://schemas.microsoft.com/office/drawing/2010/main" val="0"/>
@@ -124,21 +124,12 @@
         </w:rPr>
         <w:t xml:space="preserve"> </w:t>
       </w:r>
-      <w:proofErr w:type="spellStart"/>
       <w:r>
         <w:rPr>
           <w:b/>
           <w:bCs/>
         </w:rPr>
-        <w:t>devsec</w:t>
-      </w:r>
-      <w:proofErr w:type="spellEnd"/>
-      <w:r>
-        <w:rPr>
-          <w:b/>
-          <w:bCs/>
-        </w:rPr>
-        <w:t xml:space="preserve"> ops</w:t>
+        <w:t>DevSecOps</w:t>
       </w:r>
     </w:p>
     <w:p>
@@ -287,13 +278,8 @@
               <w:spacing w:after="160" w:line="278" w:lineRule="auto"/>
             </w:pPr>
             <w:r>
-              <w:t xml:space="preserve">Pethvan p </w:t>
-            </w:r>
-            <w:proofErr w:type="spellStart"/>
-            <w:r>
-              <w:t>p</w:t>
-            </w:r>
-            <w:proofErr w:type="spellEnd"/>
+              <w:t>Pethvan p p</w:t>
+            </w:r>
           </w:p>
         </w:tc>
       </w:tr>
@@ -337,19 +323,9 @@
             <w:pPr>
               <w:spacing w:after="160" w:line="278" w:lineRule="auto"/>
             </w:pPr>
-            <w:proofErr w:type="spellStart"/>
-            <w:r>
-              <w:t>Aluthge</w:t>
-            </w:r>
-            <w:proofErr w:type="spellEnd"/>
-            <w:r>
-              <w:t xml:space="preserve"> </w:t>
-            </w:r>
-            <w:proofErr w:type="gramStart"/>
-            <w:r>
-              <w:t>M.N</w:t>
-            </w:r>
-            <w:proofErr w:type="gramEnd"/>
+            <w:r>
+              <w:t>Aluthge M.N</w:t>
+            </w:r>
           </w:p>
         </w:tc>
       </w:tr>
@@ -394,13 +370,8 @@
               <w:spacing w:after="160" w:line="278" w:lineRule="auto"/>
             </w:pPr>
             <w:r>
-              <w:t>Adithya E.A.D.</w:t>
-            </w:r>
-            <w:proofErr w:type="gramStart"/>
-            <w:r>
-              <w:t>D.D</w:t>
-            </w:r>
-            <w:proofErr w:type="gramEnd"/>
+              <w:t>Adithya E.A.D.D.D</w:t>
+            </w:r>
           </w:p>
         </w:tc>
       </w:tr>
@@ -444,13 +415,8 @@
             <w:pPr>
               <w:spacing w:after="160" w:line="278" w:lineRule="auto"/>
             </w:pPr>
-            <w:proofErr w:type="spellStart"/>
-            <w:r>
-              <w:t>Shanthoshika</w:t>
-            </w:r>
-            <w:proofErr w:type="spellEnd"/>
-            <w:r>
-              <w:t xml:space="preserve"> S</w:t>
+            <w:r>
+              <w:t>Shanthoshika S</w:t>
             </w:r>
           </w:p>
         </w:tc>
@@ -464,7 +430,13 @@
     <w:sdt>
       <w:sdtPr>
         <w:rPr>
+          <w:rFonts w:asciiTheme="minorHAnsi" w:eastAsiaTheme="minorHAnsi" w:hAnsiTheme="minorHAnsi" w:cstheme="minorBidi"/>
+          <w:color w:val="auto"/>
+          <w:kern w:val="2"/>
+          <w:sz w:val="24"/>
+          <w:szCs w:val="24"/>
           <w:lang w:val="en-GB"/>
+          <w14:ligatures w14:val="standardContextual"/>
         </w:rPr>
         <w:id w:val="1609926164"/>
         <w:docPartObj>
@@ -474,14 +446,8 @@
       </w:sdtPr>
       <w:sdtEndPr>
         <w:rPr>
-          <w:rFonts w:asciiTheme="minorHAnsi" w:eastAsiaTheme="minorHAnsi" w:hAnsiTheme="minorHAnsi" w:cstheme="minorBidi"/>
           <w:b/>
           <w:bCs/>
-          <w:color w:val="auto"/>
-          <w:kern w:val="2"/>
-          <w:sz w:val="24"/>
-          <w:szCs w:val="24"/>
-          <w14:ligatures w14:val="standardContextual"/>
         </w:rPr>
       </w:sdtEndPr>
       <w:sdtContent>
@@ -521,7 +487,7 @@
           <w:r>
             <w:fldChar w:fldCharType="separate"/>
           </w:r>
-          <w:hyperlink w:anchor="_Toc240904201" w:history="1">
+          <w:hyperlink w:anchor="_Toc241002870" w:history="1">
             <w:r>
               <w:rPr>
                 <w:rStyle w:val="Hyperlink"/>
@@ -548,7 +514,7 @@
                 <w:noProof/>
                 <w:webHidden/>
               </w:rPr>
-              <w:instrText xml:space="preserve"> PAGEREF _Toc240904201 \h </w:instrText>
+              <w:instrText xml:space="preserve"> PAGEREF _Toc241002870 \h </w:instrText>
             </w:r>
             <w:r>
               <w:rPr>
@@ -594,7 +560,7 @@
               <w14:ligatures w14:val="standardContextual"/>
             </w:rPr>
           </w:pPr>
-          <w:hyperlink w:anchor="_Toc240904202" w:history="1">
+          <w:hyperlink w:anchor="_Toc241002871" w:history="1">
             <w:r>
               <w:rPr>
                 <w:rStyle w:val="Hyperlink"/>
@@ -621,7 +587,7 @@
                 <w:noProof/>
                 <w:webHidden/>
               </w:rPr>
-              <w:instrText xml:space="preserve"> PAGEREF _Toc240904202 \h </w:instrText>
+              <w:instrText xml:space="preserve"> PAGEREF _Toc241002871 \h </w:instrText>
             </w:r>
             <w:r>
               <w:rPr>
@@ -667,7 +633,7 @@
               <w14:ligatures w14:val="standardContextual"/>
             </w:rPr>
           </w:pPr>
-          <w:hyperlink w:anchor="_Toc240904203" w:history="1">
+          <w:hyperlink w:anchor="_Toc241002872" w:history="1">
             <w:r>
               <w:rPr>
                 <w:rStyle w:val="Hyperlink"/>
@@ -694,7 +660,7 @@
                 <w:noProof/>
                 <w:webHidden/>
               </w:rPr>
-              <w:instrText xml:space="preserve"> PAGEREF _Toc240904203 \h </w:instrText>
+              <w:instrText xml:space="preserve"> PAGEREF _Toc241002872 \h </w:instrText>
             </w:r>
             <w:r>
               <w:rPr>
@@ -740,7 +706,7 @@
               <w14:ligatures w14:val="standardContextual"/>
             </w:rPr>
           </w:pPr>
-          <w:hyperlink w:anchor="_Toc240904204" w:history="1">
+          <w:hyperlink w:anchor="_Toc241002873" w:history="1">
             <w:r>
               <w:rPr>
                 <w:rStyle w:val="Hyperlink"/>
@@ -767,7 +733,7 @@
                 <w:noProof/>
                 <w:webHidden/>
               </w:rPr>
-              <w:instrText xml:space="preserve"> PAGEREF _Toc240904204 \h </w:instrText>
+              <w:instrText xml:space="preserve"> PAGEREF _Toc241002873 \h </w:instrText>
             </w:r>
             <w:r>
               <w:rPr>
@@ -788,6 +754,152 @@
                 <w:webHidden/>
               </w:rPr>
               <w:t>- 3 -</w:t>
+            </w:r>
+            <w:r>
+              <w:rPr>
+                <w:noProof/>
+                <w:webHidden/>
+              </w:rPr>
+              <w:fldChar w:fldCharType="end"/>
+            </w:r>
+          </w:hyperlink>
+        </w:p>
+        <w:p>
+          <w:pPr>
+            <w:pStyle w:val="TOC1"/>
+            <w:tabs>
+              <w:tab w:val="right" w:pos="9350"/>
+            </w:tabs>
+            <w:rPr>
+              <w:rFonts w:cstheme="minorBidi"/>
+              <w:noProof/>
+              <w:kern w:val="2"/>
+              <w:sz w:val="24"/>
+              <w:szCs w:val="24"/>
+              <w14:ligatures w14:val="standardContextual"/>
+            </w:rPr>
+          </w:pPr>
+          <w:hyperlink w:anchor="_Toc241002874" w:history="1">
+            <w:r>
+              <w:rPr>
+                <w:rStyle w:val="Hyperlink"/>
+                <w:noProof/>
+              </w:rPr>
+              <w:t>Thread modeling and risk assessment</w:t>
+            </w:r>
+            <w:r>
+              <w:rPr>
+                <w:noProof/>
+                <w:webHidden/>
+              </w:rPr>
+              <w:tab/>
+            </w:r>
+            <w:r>
+              <w:rPr>
+                <w:noProof/>
+                <w:webHidden/>
+              </w:rPr>
+              <w:fldChar w:fldCharType="begin"/>
+            </w:r>
+            <w:r>
+              <w:rPr>
+                <w:noProof/>
+                <w:webHidden/>
+              </w:rPr>
+              <w:instrText xml:space="preserve"> PAGEREF _Toc241002874 \h </w:instrText>
+            </w:r>
+            <w:r>
+              <w:rPr>
+                <w:noProof/>
+                <w:webHidden/>
+              </w:rPr>
+            </w:r>
+            <w:r>
+              <w:rPr>
+                <w:noProof/>
+                <w:webHidden/>
+              </w:rPr>
+              <w:fldChar w:fldCharType="separate"/>
+            </w:r>
+            <w:r>
+              <w:rPr>
+                <w:noProof/>
+                <w:webHidden/>
+              </w:rPr>
+              <w:t>- 5 -</w:t>
+            </w:r>
+            <w:r>
+              <w:rPr>
+                <w:noProof/>
+                <w:webHidden/>
+              </w:rPr>
+              <w:fldChar w:fldCharType="end"/>
+            </w:r>
+          </w:hyperlink>
+        </w:p>
+        <w:p>
+          <w:pPr>
+            <w:pStyle w:val="TOC2"/>
+            <w:tabs>
+              <w:tab w:val="right" w:pos="9350"/>
+            </w:tabs>
+            <w:rPr>
+              <w:rFonts w:cstheme="minorBidi"/>
+              <w:noProof/>
+              <w:kern w:val="2"/>
+              <w:sz w:val="24"/>
+              <w:szCs w:val="24"/>
+              <w14:ligatures w14:val="standardContextual"/>
+            </w:rPr>
+          </w:pPr>
+          <w:hyperlink w:anchor="_Toc241002875" w:history="1">
+            <w:r>
+              <w:rPr>
+                <w:rStyle w:val="Hyperlink"/>
+                <w:noProof/>
+              </w:rPr>
+              <w:t>Stride thread model</w:t>
+            </w:r>
+            <w:r>
+              <w:rPr>
+                <w:noProof/>
+                <w:webHidden/>
+              </w:rPr>
+              <w:tab/>
+            </w:r>
+            <w:r>
+              <w:rPr>
+                <w:noProof/>
+                <w:webHidden/>
+              </w:rPr>
+              <w:fldChar w:fldCharType="begin"/>
+            </w:r>
+            <w:r>
+              <w:rPr>
+                <w:noProof/>
+                <w:webHidden/>
+              </w:rPr>
+              <w:instrText xml:space="preserve"> PAGEREF _Toc241002875 \h </w:instrText>
+            </w:r>
+            <w:r>
+              <w:rPr>
+                <w:noProof/>
+                <w:webHidden/>
+              </w:rPr>
+            </w:r>
+            <w:r>
+              <w:rPr>
+                <w:noProof/>
+                <w:webHidden/>
+              </w:rPr>
+              <w:fldChar w:fldCharType="separate"/>
+            </w:r>
+            <w:r>
+              <w:rPr>
+                <w:noProof/>
+                <w:webHidden/>
+              </w:rPr>
+              <w:t>- 5 -</w:t>
             </w:r>
             <w:r>
               <w:rPr>
@@ -822,7 +934,7 @@
         <w:pStyle w:val="Heading1"/>
         <w:jc w:val="center"/>
       </w:pPr>
-      <w:bookmarkStart w:id="0" w:name="_Toc240904201"/>
+      <w:bookmarkStart w:id="0" w:name="_Toc241002870"/>
       <w:r>
         <w:lastRenderedPageBreak/>
         <w:t>Application, Architecture and Containerizations</w:t>
@@ -833,28 +945,15 @@
       <w:pPr>
         <w:pStyle w:val="Heading2"/>
       </w:pPr>
-      <w:bookmarkStart w:id="1" w:name="_Toc240904202"/>
-      <w:proofErr w:type="spellStart"/>
-      <w:r>
-        <w:t>Multiocintainer</w:t>
-      </w:r>
-      <w:proofErr w:type="spellEnd"/>
-      <w:r>
-        <w:t xml:space="preserve"> stack</w:t>
+      <w:bookmarkStart w:id="1" w:name="_Toc241002871"/>
+      <w:r>
+        <w:t>Multiocintainer stack</w:t>
       </w:r>
       <w:bookmarkEnd w:id="1"/>
     </w:p>
     <w:p>
       <w:r>
-        <w:t xml:space="preserve">The deployment architecture partitions OWASP </w:t>
-      </w:r>
-      <w:proofErr w:type="spellStart"/>
-      <w:r>
-        <w:t>NodeGoat</w:t>
-      </w:r>
-      <w:proofErr w:type="spellEnd"/>
-      <w:r>
-        <w:t xml:space="preserve"> into two discrete containerized tiers </w:t>
+        <w:t xml:space="preserve">The deployment architecture partitions OWASP NodeGoat into two discrete containerized tiers </w:t>
       </w:r>
     </w:p>
     <w:p>
@@ -866,15 +965,7 @@
         </w:numPr>
       </w:pPr>
       <w:r>
-        <w:t>The application runtime tier(</w:t>
-      </w:r>
-      <w:proofErr w:type="spellStart"/>
-      <w:r>
-        <w:t>nodegoat</w:t>
-      </w:r>
-      <w:proofErr w:type="spellEnd"/>
-      <w:r>
-        <w:t>-web)</w:t>
+        <w:t>The application runtime tier(nodegoat-web)</w:t>
       </w:r>
     </w:p>
     <w:p>
@@ -886,36 +977,12 @@
         </w:numPr>
       </w:pPr>
       <w:r>
-        <w:t xml:space="preserve">Data storage </w:t>
-      </w:r>
-      <w:proofErr w:type="gramStart"/>
-      <w:r>
-        <w:t>tier</w:t>
-      </w:r>
-      <w:proofErr w:type="gramEnd"/>
-      <w:r>
-        <w:t>(</w:t>
-      </w:r>
-      <w:proofErr w:type="spellStart"/>
-      <w:r>
-        <w:t>nodegoat-db</w:t>
-      </w:r>
-      <w:proofErr w:type="spellEnd"/>
-      <w:r>
-        <w:t>)</w:t>
-      </w:r>
-    </w:p>
-    <w:p>
-      <w:r>
-        <w:t xml:space="preserve">Using docker compose the system build and start in fully </w:t>
-      </w:r>
-      <w:proofErr w:type="spellStart"/>
-      <w:r>
-        <w:t>self container</w:t>
-      </w:r>
-      <w:proofErr w:type="spellEnd"/>
-      <w:r>
-        <w:t xml:space="preserve"> offline status single command </w:t>
+        <w:t>Data storage tier(nodegoat-db)</w:t>
+      </w:r>
+    </w:p>
+    <w:p>
+      <w:r>
+        <w:t xml:space="preserve">Using docker compose the system build and start in fully self container offline status single command </w:t>
       </w:r>
       <w:r>
         <w:rPr>
@@ -925,46 +992,14 @@
         <w:t xml:space="preserve">docker compose up –build. </w:t>
       </w:r>
       <w:r>
-        <w:t xml:space="preserve">The web </w:t>
-      </w:r>
-      <w:proofErr w:type="gramStart"/>
-      <w:r>
-        <w:t>container  manage</w:t>
-      </w:r>
-      <w:proofErr w:type="gramEnd"/>
-      <w:r>
-        <w:t xml:space="preserve"> express application handling and isolated mongo-</w:t>
-      </w:r>
-      <w:proofErr w:type="spellStart"/>
-      <w:r>
-        <w:t>db</w:t>
-      </w:r>
-      <w:proofErr w:type="spellEnd"/>
-      <w:r>
-        <w:t xml:space="preserve"> database management manage in </w:t>
-      </w:r>
-      <w:proofErr w:type="spellStart"/>
-      <w:r>
-        <w:t>db</w:t>
-      </w:r>
-      <w:proofErr w:type="spellEnd"/>
-      <w:r>
-        <w:t xml:space="preserve"> docker using </w:t>
-      </w:r>
-      <w:proofErr w:type="spellStart"/>
-      <w:r>
-        <w:t>tcp</w:t>
-      </w:r>
-      <w:proofErr w:type="spellEnd"/>
-      <w:r>
-        <w:t xml:space="preserve"> port 27017 for monitoring scripts and logs</w:t>
+        <w:t>The web container  manage express application handling and isolated mongo-db database management manage in db docker using tcp port 27017 for monitoring scripts and logs</w:t>
       </w:r>
     </w:p>
     <w:p>
       <w:pPr>
         <w:pStyle w:val="Heading2"/>
       </w:pPr>
-      <w:bookmarkStart w:id="2" w:name="_Toc240904203"/>
+      <w:bookmarkStart w:id="2" w:name="_Toc241002872"/>
       <w:r>
         <w:t>Container hardening and principle of least privilege</w:t>
       </w:r>
@@ -974,13 +1009,8 @@
       <w:r>
         <w:t xml:space="preserve">To mitigate container </w:t>
       </w:r>
-      <w:proofErr w:type="gramStart"/>
-      <w:r>
-        <w:t>brake</w:t>
-      </w:r>
-      <w:proofErr w:type="gramEnd"/>
-      <w:r>
-        <w:t xml:space="preserve"> down</w:t>
+      <w:r>
+        <w:t>brake down</w:t>
       </w:r>
       <w:r>
         <w:t xml:space="preserve"> and privilege escalation risks the application container explicitly </w:t>
@@ -995,15 +1025,7 @@
         <w:t>Docker file</w:t>
       </w:r>
       <w:r>
-        <w:t xml:space="preserve"> </w:t>
-      </w:r>
-      <w:proofErr w:type="gramStart"/>
-      <w:r>
-        <w:t>apply</w:t>
-      </w:r>
-      <w:proofErr w:type="gramEnd"/>
-      <w:r>
-        <w:t xml:space="preserve"> </w:t>
+        <w:t xml:space="preserve"> apply </w:t>
       </w:r>
       <w:r>
         <w:t>user mode</w:t>
@@ -1019,7 +1041,7 @@
       <w:pPr>
         <w:pStyle w:val="Heading2"/>
       </w:pPr>
-      <w:bookmarkStart w:id="3" w:name="_Toc240904204"/>
+      <w:bookmarkStart w:id="3" w:name="_Toc241002873"/>
       <w:r>
         <w:t xml:space="preserve">Network segmentation and trust </w:t>
       </w:r>
@@ -1100,8 +1122,6 @@
       <w:r>
         <w:t xml:space="preserve">configure with </w:t>
       </w:r>
-      <w:proofErr w:type="spellStart"/>
-      <w:proofErr w:type="gramStart"/>
       <w:r>
         <w:rPr>
           <w:b/>
@@ -1109,8 +1129,6 @@
         </w:rPr>
         <w:t>internal:true</w:t>
       </w:r>
-      <w:proofErr w:type="spellEnd"/>
-      <w:proofErr w:type="gramEnd"/>
       <w:r>
         <w:t xml:space="preserve"> to </w:t>
       </w:r>
@@ -1140,6 +1158,9 @@
     </w:p>
     <w:p>
       <w:r>
+        <w:rPr>
+          <w:noProof/>
+        </w:rPr>
         <w:drawing>
           <wp:inline distT="0" distB="0" distL="0" distR="0" wp14:anchorId="603EE302" wp14:editId="2F0051CC">
             <wp:extent cx="5943600" cy="366395"/>
@@ -1156,7 +1177,7 @@
                     <pic:cNvPicPr/>
                   </pic:nvPicPr>
                   <pic:blipFill>
-                    <a:blip r:embed="rId9"/>
+                    <a:blip r:embed="rId12"/>
                     <a:stretch>
                       <a:fillRect/>
                     </a:stretch>
@@ -1179,6 +1200,9 @@
     </w:p>
     <w:p>
       <w:r>
+        <w:rPr>
+          <w:noProof/>
+        </w:rPr>
         <w:drawing>
           <wp:inline distT="0" distB="0" distL="0" distR="0" wp14:anchorId="38294BBA" wp14:editId="2248D94E">
             <wp:extent cx="5943600" cy="479425"/>
@@ -1195,7 +1219,7 @@
                     <pic:cNvPicPr/>
                   </pic:nvPicPr>
                   <pic:blipFill>
-                    <a:blip r:embed="rId10"/>
+                    <a:blip r:embed="rId13"/>
                     <a:stretch>
                       <a:fillRect/>
                     </a:stretch>
@@ -1218,6 +1242,9 @@
     </w:p>
     <w:p>
       <w:r>
+        <w:rPr>
+          <w:noProof/>
+        </w:rPr>
         <w:lastRenderedPageBreak/>
         <w:drawing>
           <wp:inline distT="0" distB="0" distL="0" distR="0" wp14:anchorId="4CEBA7DE" wp14:editId="2529F393">
@@ -1235,7 +1262,7 @@
                     <pic:cNvPicPr/>
                   </pic:nvPicPr>
                   <pic:blipFill>
-                    <a:blip r:embed="rId11"/>
+                    <a:blip r:embed="rId14"/>
                     <a:stretch>
                       <a:fillRect/>
                     </a:stretch>
@@ -1277,7 +1304,7 @@
                     <pic:cNvPicPr/>
                   </pic:nvPicPr>
                   <pic:blipFill>
-                    <a:blip r:embed="rId12">
+                    <a:blip r:embed="rId15">
                       <a:extLst>
                         <a:ext uri="{28A0092B-C50C-407E-A947-70E740481C1C}">
                           <a14:useLocalDpi xmlns:a14="http://schemas.microsoft.com/office/drawing/2010/main" val="0"/>
@@ -1309,9 +1336,827 @@
         <w:br w:type="page"/>
       </w:r>
     </w:p>
+    <w:p>
+      <w:pPr>
+        <w:pStyle w:val="Heading1"/>
+      </w:pPr>
+      <w:bookmarkStart w:id="4" w:name="_Toc241002874"/>
+      <w:r>
+        <w:lastRenderedPageBreak/>
+        <w:t>Thread modeling and risk assessment</w:t>
+      </w:r>
+      <w:bookmarkEnd w:id="4"/>
+    </w:p>
+    <w:p>
+      <w:pPr>
+        <w:pStyle w:val="Heading2"/>
+      </w:pPr>
+      <w:bookmarkStart w:id="5" w:name="_Toc241002875"/>
+      <w:r>
+        <w:t>S</w:t>
+      </w:r>
+      <w:r>
+        <w:t>t</w:t>
+      </w:r>
+      <w:r>
+        <w:t>ride thread model</w:t>
+      </w:r>
+      <w:bookmarkEnd w:id="5"/>
+    </w:p>
+    <w:p>
+      <w:r>
+        <w:t>Below are four realistic, application-specific threats that might target the NodeGoat architecture. The threats were identified using the STRIDE methodology.</w:t>
+      </w:r>
+    </w:p>
+    <w:p>
+      <w:pPr>
+        <w:pStyle w:val="ListParagraph"/>
+        <w:numPr>
+          <w:ilvl w:val="0"/>
+          <w:numId w:val="4"/>
+        </w:numPr>
+      </w:pPr>
+      <w:r>
+        <w:rPr>
+          <w:b/>
+          <w:bCs/>
+        </w:rPr>
+        <w:t>Spoofing (Authentication Bypass via NoSQL Injection):</w:t>
+      </w:r>
+    </w:p>
+    <w:p>
+      <w:pPr>
+        <w:pStyle w:val="ListParagraph"/>
+      </w:pPr>
+      <w:r>
+        <w:t xml:space="preserve"> An attacker can launch a NoSQL injection attack by sending a malicious JSON object to the /login API. By replacing the password value with a MongoDB operator, such as {"password": {"$ne": null}}, and taking advantage of the fact that Express does not enforce typechecking on the input, the attacker can bypass authentication and hijack an administrator’s session. No credentials would be required to perform this attack, apart from basic knowledge of the MongoDB query language.</w:t>
+      </w:r>
+    </w:p>
+    <w:p>
+      <w:pPr>
+        <w:pStyle w:val="ListParagraph"/>
+        <w:numPr>
+          <w:ilvl w:val="0"/>
+          <w:numId w:val="4"/>
+        </w:numPr>
+      </w:pPr>
+      <w:r>
+        <w:rPr>
+          <w:b/>
+          <w:bCs/>
+        </w:rPr>
+        <w:t>Tampering (Insecure Direct Object Reference on Allocations):</w:t>
+      </w:r>
+      <w:r>
+        <w:t xml:space="preserve"> An authenticated attacker can tamper with allocation records by modifying the request sent to the server when the attacker attempts to update their asset allocation. By changing the userId value in the request to another value, the attacker can effectively change the allocation records of another user. The vulnerability stems from the fact that the server does not check whether the userId belongs to the authenticated attacker.</w:t>
+      </w:r>
+    </w:p>
+    <w:p>
+      <w:pPr>
+        <w:pStyle w:val="ListParagraph"/>
+        <w:numPr>
+          <w:ilvl w:val="0"/>
+          <w:numId w:val="4"/>
+        </w:numPr>
+      </w:pPr>
+      <w:r>
+        <w:rPr>
+          <w:b/>
+          <w:bCs/>
+        </w:rPr>
+        <w:t>Information Disclosure (Hardcoded Database Credentials):</w:t>
+      </w:r>
+      <w:r>
+        <w:t xml:space="preserve"> A developer could accidentally commit the database credentials required to connect to the MongoDB server and sign cookies for the Express framework in the config/env/development.js file or the docker-compose.yml file. If this information becomes available to an attacker, they can utilize it to connect to the database directly and forge valid session cookies to hijack the administrator’s session.</w:t>
+      </w:r>
+    </w:p>
+    <w:p>
+      <w:pPr>
+        <w:pStyle w:val="ListParagraph"/>
+        <w:numPr>
+          <w:ilvl w:val="0"/>
+          <w:numId w:val="4"/>
+        </w:numPr>
+      </w:pPr>
+      <w:r>
+        <w:rPr>
+          <w:b/>
+          <w:bCs/>
+        </w:rPr>
+        <w:t>Denial of Service (Unbounded Payload Exhaustion):</w:t>
+      </w:r>
+      <w:r>
+        <w:t xml:space="preserve"> An attacker can utilize a large JSON payload to exhaust the CPU resources on the Node.js server. Since Node.js runs on a single thread, any request that requires deep traversal of the JSON object will monopolize the CPU and deny service to other users. This threat is particularly concerning because there is no built-in defense against it in the Node.js framework itself.</w:t>
+      </w:r>
+    </w:p>
+    <w:p>
+      <w:r>
+        <w:br w:type="page"/>
+      </w:r>
+    </w:p>
+    <w:p>
+      <w:pPr>
+        <w:pStyle w:val="Heading2"/>
+      </w:pPr>
+      <w:r>
+        <w:lastRenderedPageBreak/>
+        <w:t>Risk evaluation matrix</w:t>
+      </w:r>
+    </w:p>
+    <w:p>
+      <w:r>
+        <w:t xml:space="preserve">Each thread is scored on a5x5 matrix evaluating </w:t>
+      </w:r>
+      <w:r>
+        <w:rPr>
+          <w:b/>
+          <w:bCs/>
+        </w:rPr>
+        <w:t>likelihood(</w:t>
+      </w:r>
+      <w:r>
+        <w:t>how easy/often the attack can be executed</w:t>
+      </w:r>
+      <w:r>
+        <w:rPr>
+          <w:b/>
+          <w:bCs/>
+        </w:rPr>
+        <w:t xml:space="preserve">) </w:t>
+      </w:r>
+      <w:r>
+        <w:t xml:space="preserve">and </w:t>
+      </w:r>
+      <w:r>
+        <w:rPr>
+          <w:b/>
+          <w:bCs/>
+        </w:rPr>
+        <w:t xml:space="preserve">impact </w:t>
+      </w:r>
+      <w:r>
+        <w:t>resulting in an overkill risk rating.</w:t>
+      </w:r>
+    </w:p>
+    <w:tbl>
+      <w:tblPr>
+        <w:tblStyle w:val="TableGrid"/>
+        <w:tblW w:w="0" w:type="auto"/>
+        <w:tblLook w:val="04A0" w:firstRow="1" w:lastRow="0" w:firstColumn="1" w:lastColumn="0" w:noHBand="0" w:noVBand="1"/>
+      </w:tblPr>
+      <w:tblGrid>
+        <w:gridCol w:w="2393"/>
+        <w:gridCol w:w="2321"/>
+        <w:gridCol w:w="2318"/>
+        <w:gridCol w:w="2318"/>
+      </w:tblGrid>
+      <w:tr>
+        <w:tc>
+          <w:tcPr>
+            <w:tcW w:w="2337" w:type="dxa"/>
+          </w:tcPr>
+          <w:p>
+            <w:r>
+              <w:t>thread</w:t>
+            </w:r>
+          </w:p>
+        </w:tc>
+        <w:tc>
+          <w:tcPr>
+            <w:tcW w:w="2337" w:type="dxa"/>
+          </w:tcPr>
+          <w:p>
+            <w:r>
+              <w:t>like</w:t>
+            </w:r>
+            <w:r>
+              <w:t>li</w:t>
+            </w:r>
+            <w:r>
+              <w:t>hood</w:t>
+            </w:r>
+          </w:p>
+        </w:tc>
+        <w:tc>
+          <w:tcPr>
+            <w:tcW w:w="2338" w:type="dxa"/>
+          </w:tcPr>
+          <w:p>
+            <w:r>
+              <w:t>impact</w:t>
+            </w:r>
+          </w:p>
+        </w:tc>
+        <w:tc>
+          <w:tcPr>
+            <w:tcW w:w="2338" w:type="dxa"/>
+          </w:tcPr>
+          <w:p>
+            <w:r>
+              <w:t>Overall risk</w:t>
+            </w:r>
+            <w:r>
+              <w:t>s</w:t>
+            </w:r>
+          </w:p>
+        </w:tc>
+      </w:tr>
+      <w:tr>
+        <w:tc>
+          <w:tcPr>
+            <w:tcW w:w="2337" w:type="dxa"/>
+          </w:tcPr>
+          <w:p>
+            <w:r>
+              <w:t>Spoofing(login no SQLi)</w:t>
+            </w:r>
+          </w:p>
+        </w:tc>
+        <w:tc>
+          <w:tcPr>
+            <w:tcW w:w="2337" w:type="dxa"/>
+          </w:tcPr>
+          <w:p>
+            <w:r>
+              <w:t>5</w:t>
+            </w:r>
+          </w:p>
+        </w:tc>
+        <w:tc>
+          <w:tcPr>
+            <w:tcW w:w="2338" w:type="dxa"/>
+          </w:tcPr>
+          <w:p>
+            <w:r>
+              <w:t>5</w:t>
+            </w:r>
+          </w:p>
+        </w:tc>
+        <w:tc>
+          <w:tcPr>
+            <w:tcW w:w="2338" w:type="dxa"/>
+          </w:tcPr>
+          <w:p>
+            <w:r>
+              <w:t>25</w:t>
+            </w:r>
+          </w:p>
+        </w:tc>
+      </w:tr>
+      <w:tr>
+        <w:tc>
+          <w:tcPr>
+            <w:tcW w:w="2337" w:type="dxa"/>
+          </w:tcPr>
+          <w:p>
+            <w:r>
+              <w:t>Tempering(allocation IDOR)</w:t>
+            </w:r>
+          </w:p>
+        </w:tc>
+        <w:tc>
+          <w:tcPr>
+            <w:tcW w:w="2337" w:type="dxa"/>
+          </w:tcPr>
+          <w:p>
+            <w:r>
+              <w:t>4</w:t>
+            </w:r>
+          </w:p>
+        </w:tc>
+        <w:tc>
+          <w:tcPr>
+            <w:tcW w:w="2338" w:type="dxa"/>
+          </w:tcPr>
+          <w:p>
+            <w:r>
+              <w:t>4</w:t>
+            </w:r>
+          </w:p>
+        </w:tc>
+        <w:tc>
+          <w:tcPr>
+            <w:tcW w:w="2338" w:type="dxa"/>
+          </w:tcPr>
+          <w:p>
+            <w:r>
+              <w:t>16</w:t>
+            </w:r>
+          </w:p>
+        </w:tc>
+      </w:tr>
+      <w:tr>
+        <w:tc>
+          <w:tcPr>
+            <w:tcW w:w="2337" w:type="dxa"/>
+          </w:tcPr>
+          <w:p>
+            <w:r>
+              <w:t>Info disclosure(secrets in G</w:t>
+            </w:r>
+            <w:r>
+              <w:t>i</w:t>
+            </w:r>
+            <w:r>
+              <w:t>t)</w:t>
+            </w:r>
+          </w:p>
+        </w:tc>
+        <w:tc>
+          <w:tcPr>
+            <w:tcW w:w="2337" w:type="dxa"/>
+          </w:tcPr>
+          <w:p>
+            <w:r>
+              <w:t>5</w:t>
+            </w:r>
+          </w:p>
+        </w:tc>
+        <w:tc>
+          <w:tcPr>
+            <w:tcW w:w="2338" w:type="dxa"/>
+          </w:tcPr>
+          <w:p>
+            <w:r>
+              <w:t>4</w:t>
+            </w:r>
+          </w:p>
+        </w:tc>
+        <w:tc>
+          <w:tcPr>
+            <w:tcW w:w="2338" w:type="dxa"/>
+          </w:tcPr>
+          <w:p>
+            <w:r>
+              <w:t>20</w:t>
+            </w:r>
+          </w:p>
+        </w:tc>
+      </w:tr>
+      <w:tr>
+        <w:tc>
+          <w:tcPr>
+            <w:tcW w:w="2337" w:type="dxa"/>
+          </w:tcPr>
+          <w:p>
+            <w:r>
+              <w:t>Dos(</w:t>
+            </w:r>
+            <w:r>
+              <w:t>Payload</w:t>
+            </w:r>
+            <w:r>
+              <w:t xml:space="preserve"> exhaustion)</w:t>
+            </w:r>
+          </w:p>
+        </w:tc>
+        <w:tc>
+          <w:tcPr>
+            <w:tcW w:w="2337" w:type="dxa"/>
+          </w:tcPr>
+          <w:p>
+            <w:r>
+              <w:t>3</w:t>
+            </w:r>
+          </w:p>
+        </w:tc>
+        <w:tc>
+          <w:tcPr>
+            <w:tcW w:w="2338" w:type="dxa"/>
+          </w:tcPr>
+          <w:p>
+            <w:r>
+              <w:t>3</w:t>
+            </w:r>
+          </w:p>
+        </w:tc>
+        <w:tc>
+          <w:tcPr>
+            <w:tcW w:w="2338" w:type="dxa"/>
+          </w:tcPr>
+          <w:p>
+            <w:r>
+              <w:t>9</w:t>
+            </w:r>
+          </w:p>
+        </w:tc>
+      </w:tr>
+    </w:tbl>
     <w:p/>
+    <w:p>
+      <w:pPr>
+        <w:pStyle w:val="Heading2"/>
+      </w:pPr>
+      <w:r>
+        <w:t>Thread to control mapping</w:t>
+      </w:r>
+    </w:p>
+    <w:p>
+      <w:r>
+        <w:t>This table directly identified threats to the specific security controls implemented in pipeline and codebase</w:t>
+      </w:r>
+    </w:p>
+    <w:tbl>
+      <w:tblPr>
+        <w:tblStyle w:val="TableGrid"/>
+        <w:tblW w:w="0" w:type="auto"/>
+        <w:tblLook w:val="04A0" w:firstRow="1" w:lastRow="0" w:firstColumn="1" w:lastColumn="0" w:noHBand="0" w:noVBand="1"/>
+      </w:tblPr>
+      <w:tblGrid>
+        <w:gridCol w:w="1335"/>
+        <w:gridCol w:w="1622"/>
+        <w:gridCol w:w="1002"/>
+        <w:gridCol w:w="2099"/>
+        <w:gridCol w:w="3292"/>
+      </w:tblGrid>
+      <w:tr>
+        <w:tc>
+          <w:tcPr>
+            <w:tcW w:w="1435" w:type="dxa"/>
+          </w:tcPr>
+          <w:p>
+            <w:r>
+              <w:t xml:space="preserve">Threat category </w:t>
+            </w:r>
+          </w:p>
+        </w:tc>
+        <w:tc>
+          <w:tcPr>
+            <w:tcW w:w="1980" w:type="dxa"/>
+          </w:tcPr>
+          <w:p>
+            <w:r>
+              <w:t>Vulnerability scenario</w:t>
+            </w:r>
+          </w:p>
+        </w:tc>
+        <w:tc>
+          <w:tcPr>
+            <w:tcW w:w="1260" w:type="dxa"/>
+          </w:tcPr>
+          <w:p>
+            <w:r>
+              <w:t>Risk level</w:t>
+            </w:r>
+          </w:p>
+        </w:tc>
+        <w:tc>
+          <w:tcPr>
+            <w:tcW w:w="2486" w:type="dxa"/>
+          </w:tcPr>
+          <w:p>
+            <w:r>
+              <w:t>Mitigating control</w:t>
+            </w:r>
+          </w:p>
+        </w:tc>
+        <w:tc>
+          <w:tcPr>
+            <w:tcW w:w="2189" w:type="dxa"/>
+          </w:tcPr>
+          <w:p>
+            <w:r>
+              <w:t>Codebase/pipeline location</w:t>
+            </w:r>
+          </w:p>
+        </w:tc>
+      </w:tr>
+      <w:tr>
+        <w:tc>
+          <w:tcPr>
+            <w:tcW w:w="1435" w:type="dxa"/>
+          </w:tcPr>
+          <w:p>
+            <w:r>
+              <w:t>Spoofing</w:t>
+            </w:r>
+          </w:p>
+        </w:tc>
+        <w:tc>
+          <w:tcPr>
+            <w:tcW w:w="1980" w:type="dxa"/>
+          </w:tcPr>
+          <w:p>
+            <w:r>
+              <w:t>NoSQL injection in login bypassing authentication</w:t>
+            </w:r>
+          </w:p>
+        </w:tc>
+        <w:tc>
+          <w:tcPr>
+            <w:tcW w:w="1260" w:type="dxa"/>
+          </w:tcPr>
+          <w:p>
+            <w:r>
+              <w:t>Critical</w:t>
+            </w:r>
+          </w:p>
+        </w:tc>
+        <w:tc>
+          <w:tcPr>
+            <w:tcW w:w="2486" w:type="dxa"/>
+          </w:tcPr>
+          <w:p>
+            <w:r>
+              <w:rPr>
+                <w:b/>
+                <w:bCs/>
+              </w:rPr>
+              <w:t>Input Validation &amp; Sanitization:</w:t>
+            </w:r>
+            <w:r>
+              <w:t xml:space="preserve"> Implement strict allow-list type checking (</w:t>
+            </w:r>
+            <w:r>
+              <w:rPr>
+                <w:b/>
+                <w:bCs/>
+              </w:rPr>
+              <w:t>typeof password === 'string'</w:t>
+            </w:r>
+            <w:r>
+              <w:t>) before querying the database.</w:t>
+            </w:r>
+          </w:p>
+        </w:tc>
+        <w:tc>
+          <w:tcPr>
+            <w:tcW w:w="2189" w:type="dxa"/>
+          </w:tcPr>
+          <w:p>
+            <w:pPr>
+              <w:rPr>
+                <w:b/>
+                <w:bCs/>
+              </w:rPr>
+            </w:pPr>
+            <w:r>
+              <w:rPr>
+                <w:b/>
+                <w:bCs/>
+              </w:rPr>
+              <w:t xml:space="preserve">app/routes/session.js </w:t>
+            </w:r>
+            <w:r>
+              <w:t>and</w:t>
+            </w:r>
+            <w:r>
+              <w:rPr>
+                <w:b/>
+                <w:bCs/>
+              </w:rPr>
+              <w:t xml:space="preserve"> app/data/user-dao.js</w:t>
+            </w:r>
+          </w:p>
+        </w:tc>
+      </w:tr>
+      <w:tr>
+        <w:tc>
+          <w:tcPr>
+            <w:tcW w:w="1435" w:type="dxa"/>
+          </w:tcPr>
+          <w:p>
+            <w:r>
+              <w:t>tempering</w:t>
+            </w:r>
+          </w:p>
+        </w:tc>
+        <w:tc>
+          <w:tcPr>
+            <w:tcW w:w="1980" w:type="dxa"/>
+          </w:tcPr>
+          <w:p>
+            <w:r>
+              <w:t>Modifying other users' allocations via IDOR</w:t>
+            </w:r>
+          </w:p>
+        </w:tc>
+        <w:tc>
+          <w:tcPr>
+            <w:tcW w:w="1260" w:type="dxa"/>
+          </w:tcPr>
+          <w:p>
+            <w:r>
+              <w:t>High</w:t>
+            </w:r>
+          </w:p>
+        </w:tc>
+        <w:tc>
+          <w:tcPr>
+            <w:tcW w:w="2486" w:type="dxa"/>
+          </w:tcPr>
+          <w:p>
+            <w:r>
+              <w:rPr>
+                <w:b/>
+                <w:bCs/>
+              </w:rPr>
+              <w:t xml:space="preserve">Server-Side Authorization: </w:t>
+            </w:r>
+            <w:r>
+              <w:t>Ignore client-provided user IDs and enforce lookups strictly using the verified</w:t>
+            </w:r>
+            <w:r>
+              <w:rPr>
+                <w:b/>
+                <w:bCs/>
+              </w:rPr>
+              <w:t xml:space="preserve"> req.session.userId</w:t>
+            </w:r>
+          </w:p>
+        </w:tc>
+        <w:tc>
+          <w:tcPr>
+            <w:tcW w:w="2189" w:type="dxa"/>
+          </w:tcPr>
+          <w:p>
+            <w:pPr>
+              <w:rPr>
+                <w:b/>
+                <w:bCs/>
+              </w:rPr>
+            </w:pPr>
+            <w:r>
+              <w:rPr>
+                <w:b/>
+                <w:bCs/>
+              </w:rPr>
+              <w:t>app/routes/allocations.js</w:t>
+            </w:r>
+          </w:p>
+        </w:tc>
+      </w:tr>
+      <w:tr>
+        <w:tc>
+          <w:tcPr>
+            <w:tcW w:w="1435" w:type="dxa"/>
+          </w:tcPr>
+          <w:p>
+            <w:r>
+              <w:lastRenderedPageBreak/>
+              <w:t>Information disclosure</w:t>
+            </w:r>
+          </w:p>
+        </w:tc>
+        <w:tc>
+          <w:tcPr>
+            <w:tcW w:w="1980" w:type="dxa"/>
+          </w:tcPr>
+          <w:p>
+            <w:r>
+              <w:t>Hardcoded secrets committed to source control</w:t>
+            </w:r>
+          </w:p>
+        </w:tc>
+        <w:tc>
+          <w:tcPr>
+            <w:tcW w:w="1260" w:type="dxa"/>
+          </w:tcPr>
+          <w:p>
+            <w:r>
+              <w:t>High</w:t>
+            </w:r>
+          </w:p>
+        </w:tc>
+        <w:tc>
+          <w:tcPr>
+            <w:tcW w:w="2486" w:type="dxa"/>
+          </w:tcPr>
+          <w:p>
+            <w:r>
+              <w:rPr>
+                <w:b/>
+                <w:bCs/>
+              </w:rPr>
+              <w:t>Secret Scanning &amp; Environment Injection:</w:t>
+            </w:r>
+            <w:r>
+              <w:t xml:space="preserve"> Gitleaks prevents secret commits, and GitHub Actions Encrypted Secrets inject credentials at runtime</w:t>
+            </w:r>
+          </w:p>
+        </w:tc>
+        <w:tc>
+          <w:tcPr>
+            <w:tcW w:w="2189" w:type="dxa"/>
+          </w:tcPr>
+          <w:p>
+            <w:pPr>
+              <w:rPr>
+                <w:b/>
+                <w:bCs/>
+              </w:rPr>
+            </w:pPr>
+            <w:r>
+              <w:rPr>
+                <w:b/>
+                <w:bCs/>
+              </w:rPr>
+              <w:t>.github/workflows/devsecops-pipeline.yml</w:t>
+            </w:r>
+          </w:p>
+        </w:tc>
+      </w:tr>
+      <w:tr>
+        <w:tc>
+          <w:tcPr>
+            <w:tcW w:w="1435" w:type="dxa"/>
+          </w:tcPr>
+          <w:p>
+            <w:r>
+              <w:t>Denial of service</w:t>
+            </w:r>
+          </w:p>
+        </w:tc>
+        <w:tc>
+          <w:tcPr>
+            <w:tcW w:w="1980" w:type="dxa"/>
+          </w:tcPr>
+          <w:p>
+            <w:r>
+              <w:t>Event-loop blocking via massive JSON payloads</w:t>
+            </w:r>
+          </w:p>
+        </w:tc>
+        <w:tc>
+          <w:tcPr>
+            <w:tcW w:w="1260" w:type="dxa"/>
+          </w:tcPr>
+          <w:p>
+            <w:r>
+              <w:t>Medium</w:t>
+            </w:r>
+          </w:p>
+        </w:tc>
+        <w:tc>
+          <w:tcPr>
+            <w:tcW w:w="2486" w:type="dxa"/>
+          </w:tcPr>
+          <w:p>
+            <w:r>
+              <w:rPr>
+                <w:b/>
+                <w:bCs/>
+              </w:rPr>
+              <w:t>SAST &amp; Infrastructure Hardening</w:t>
+            </w:r>
+            <w:r>
+              <w:t xml:space="preserve">: Semgrep flags missing limits; </w:t>
+            </w:r>
+            <w:r>
+              <w:rPr>
+                <w:b/>
+                <w:bCs/>
+              </w:rPr>
+              <w:t>express.json({ limit: '10kb' })</w:t>
+            </w:r>
+            <w:r>
+              <w:t xml:space="preserve"> restricts body size.</w:t>
+            </w:r>
+          </w:p>
+        </w:tc>
+        <w:tc>
+          <w:tcPr>
+            <w:tcW w:w="2189" w:type="dxa"/>
+          </w:tcPr>
+          <w:p>
+            <w:pPr>
+              <w:rPr>
+                <w:b/>
+                <w:bCs/>
+              </w:rPr>
+            </w:pPr>
+            <w:r>
+              <w:rPr>
+                <w:b/>
+                <w:bCs/>
+              </w:rPr>
+              <w:t>.github/workflows/devsecops-pipeline.yml</w:t>
+            </w:r>
+          </w:p>
+        </w:tc>
+      </w:tr>
+    </w:tbl>
+    <w:p/>
+    <w:p>
+      <w:r>
+        <w:br w:type="page"/>
+      </w:r>
+    </w:p>
+    <w:p>
+      <w:pPr>
+        <w:pStyle w:val="Heading1"/>
+      </w:pPr>
+      <w:r>
+        <w:rPr>
+          <w:b/>
+          <w:bCs/>
+        </w:rPr>
+        <w:lastRenderedPageBreak/>
+        <w:t>Secure Coding: Exploit-and-Fix Walkthroughs</w:t>
+      </w:r>
+    </w:p>
     <w:sectPr>
-      <w:footerReference w:type="default" r:id="rId13"/>
+      <w:footerReference w:type="default" r:id="rId16"/>
       <w:pgSz w:w="12240" w:h="15840"/>
       <w:pgMar w:top="1440" w:right="1440" w:bottom="1440" w:left="1440" w:header="720" w:footer="720" w:gutter="0"/>
       <w:pgNumType w:fmt="numberInDash" w:start="1"/>
@@ -1569,6 +2414,119 @@
     </w:lvl>
   </w:abstractNum>
   <w:abstractNum w:abstractNumId="1" w15:restartNumberingAfterBreak="0">
+    <w:nsid w:val="53F950CC"/>
+    <w:multiLevelType w:val="hybridMultilevel"/>
+    <w:tmpl w:val="D3B423A6"/>
+    <w:lvl w:ilvl="0" w:tplc="0409000B">
+      <w:start w:val="1"/>
+      <w:numFmt w:val="bullet"/>
+      <w:lvlText w:val=""/>
+      <w:lvlJc w:val="left"/>
+      <w:pPr>
+        <w:ind w:left="720" w:hanging="360"/>
+      </w:pPr>
+      <w:rPr>
+        <w:rFonts w:ascii="Wingdings" w:hAnsi="Wingdings" w:hint="default"/>
+      </w:rPr>
+    </w:lvl>
+    <w:lvl w:ilvl="1" w:tplc="04090003" w:tentative="1">
+      <w:start w:val="1"/>
+      <w:numFmt w:val="bullet"/>
+      <w:lvlText w:val="o"/>
+      <w:lvlJc w:val="left"/>
+      <w:pPr>
+        <w:ind w:left="1440" w:hanging="360"/>
+      </w:pPr>
+      <w:rPr>
+        <w:rFonts w:ascii="Courier New" w:hAnsi="Courier New" w:cs="Courier New" w:hint="default"/>
+      </w:rPr>
+    </w:lvl>
+    <w:lvl w:ilvl="2" w:tplc="04090005" w:tentative="1">
+      <w:start w:val="1"/>
+      <w:numFmt w:val="bullet"/>
+      <w:lvlText w:val=""/>
+      <w:lvlJc w:val="left"/>
+      <w:pPr>
+        <w:ind w:left="2160" w:hanging="360"/>
+      </w:pPr>
+      <w:rPr>
+        <w:rFonts w:ascii="Wingdings" w:hAnsi="Wingdings" w:hint="default"/>
+      </w:rPr>
+    </w:lvl>
+    <w:lvl w:ilvl="3" w:tplc="04090001" w:tentative="1">
+      <w:start w:val="1"/>
+      <w:numFmt w:val="bullet"/>
+      <w:lvlText w:val=""/>
+      <w:lvlJc w:val="left"/>
+      <w:pPr>
+        <w:ind w:left="2880" w:hanging="360"/>
+      </w:pPr>
+      <w:rPr>
+        <w:rFonts w:ascii="Symbol" w:hAnsi="Symbol" w:hint="default"/>
+      </w:rPr>
+    </w:lvl>
+    <w:lvl w:ilvl="4" w:tplc="04090003" w:tentative="1">
+      <w:start w:val="1"/>
+      <w:numFmt w:val="bullet"/>
+      <w:lvlText w:val="o"/>
+      <w:lvlJc w:val="left"/>
+      <w:pPr>
+        <w:ind w:left="3600" w:hanging="360"/>
+      </w:pPr>
+      <w:rPr>
+        <w:rFonts w:ascii="Courier New" w:hAnsi="Courier New" w:cs="Courier New" w:hint="default"/>
+      </w:rPr>
+    </w:lvl>
+    <w:lvl w:ilvl="5" w:tplc="04090005" w:tentative="1">
+      <w:start w:val="1"/>
+      <w:numFmt w:val="bullet"/>
+      <w:lvlText w:val=""/>
+      <w:lvlJc w:val="left"/>
+      <w:pPr>
+        <w:ind w:left="4320" w:hanging="360"/>
+      </w:pPr>
+      <w:rPr>
+        <w:rFonts w:ascii="Wingdings" w:hAnsi="Wingdings" w:hint="default"/>
+      </w:rPr>
+    </w:lvl>
+    <w:lvl w:ilvl="6" w:tplc="04090001" w:tentative="1">
+      <w:start w:val="1"/>
+      <w:numFmt w:val="bullet"/>
+      <w:lvlText w:val=""/>
+      <w:lvlJc w:val="left"/>
+      <w:pPr>
+        <w:ind w:left="5040" w:hanging="360"/>
+      </w:pPr>
+      <w:rPr>
+        <w:rFonts w:ascii="Symbol" w:hAnsi="Symbol" w:hint="default"/>
+      </w:rPr>
+    </w:lvl>
+    <w:lvl w:ilvl="7" w:tplc="04090003" w:tentative="1">
+      <w:start w:val="1"/>
+      <w:numFmt w:val="bullet"/>
+      <w:lvlText w:val="o"/>
+      <w:lvlJc w:val="left"/>
+      <w:pPr>
+        <w:ind w:left="5760" w:hanging="360"/>
+      </w:pPr>
+      <w:rPr>
+        <w:rFonts w:ascii="Courier New" w:hAnsi="Courier New" w:cs="Courier New" w:hint="default"/>
+      </w:rPr>
+    </w:lvl>
+    <w:lvl w:ilvl="8" w:tplc="04090005" w:tentative="1">
+      <w:start w:val="1"/>
+      <w:numFmt w:val="bullet"/>
+      <w:lvlText w:val=""/>
+      <w:lvlJc w:val="left"/>
+      <w:pPr>
+        <w:ind w:left="6480" w:hanging="360"/>
+      </w:pPr>
+      <w:rPr>
+        <w:rFonts w:ascii="Wingdings" w:hAnsi="Wingdings" w:hint="default"/>
+      </w:rPr>
+    </w:lvl>
+  </w:abstractNum>
+  <w:abstractNum w:abstractNumId="2" w15:restartNumberingAfterBreak="0">
     <w:nsid w:val="74D03224"/>
     <w:multiLevelType w:val="hybridMultilevel"/>
     <w:tmpl w:val="8DB02508"/>
@@ -1681,7 +2639,7 @@
       </w:rPr>
     </w:lvl>
   </w:abstractNum>
-  <w:abstractNum w:abstractNumId="2" w15:restartNumberingAfterBreak="0">
+  <w:abstractNum w:abstractNumId="3" w15:restartNumberingAfterBreak="0">
     <w:nsid w:val="7AB721AC"/>
     <w:multiLevelType w:val="hybridMultilevel"/>
     <w:tmpl w:val="F6907620"/>
@@ -1795,13 +2753,16 @@
     </w:lvl>
   </w:abstractNum>
   <w:num w:numId="1" w16cid:durableId="809202912">
-    <w:abstractNumId w:val="1"/>
+    <w:abstractNumId w:val="2"/>
   </w:num>
   <w:num w:numId="2" w16cid:durableId="1199317307">
     <w:abstractNumId w:val="0"/>
   </w:num>
   <w:num w:numId="3" w16cid:durableId="873733478">
-    <w:abstractNumId w:val="2"/>
+    <w:abstractNumId w:val="3"/>
+  </w:num>
+  <w:num w:numId="4" w16cid:durableId="1791514464">
+    <w:abstractNumId w:val="1"/>
   </w:num>
 </w:numbering>
 </file>
@@ -2408,7 +3369,6 @@
   <w:style w:type="character" w:default="1" w:styleId="DefaultParagraphFont">
     <w:name w:val="Default Paragraph Font"/>
     <w:uiPriority w:val="1"/>
-    <w:semiHidden/>
     <w:unhideWhenUsed/>
   </w:style>
   <w:style w:type="table" w:default="1" w:styleId="TableNormal">
@@ -3195,10 +4155,283 @@
 <b:Sources xmlns:b="http://schemas.openxmlformats.org/officeDocument/2006/bibliography" xmlns="http://schemas.openxmlformats.org/officeDocument/2006/bibliography" SelectedStyle="\APASixthEditionOfficeOnline.xsl" StyleName="APA" Version="6"/>
 </file>
 
+<file path=customXml/item2.xml><?xml version="1.0" encoding="utf-8"?>
+<ct:contentTypeSchema xmlns:ct="http://schemas.microsoft.com/office/2006/metadata/contentType" xmlns:ma="http://schemas.microsoft.com/office/2006/metadata/properties/metaAttributes" ct:_="" ma:_="" ma:contentTypeName="Document" ma:contentTypeID="0x01010086A11BF672EA7F49BF1053710118E989" ma:contentTypeVersion="13" ma:contentTypeDescription="Create a new document." ma:contentTypeScope="" ma:versionID="5e3f34a6902b085571c7ce04a47f22cf">
+  <xsd:schema xmlns:xsd="http://www.w3.org/2001/XMLSchema" xmlns:xs="http://www.w3.org/2001/XMLSchema" xmlns:p="http://schemas.microsoft.com/office/2006/metadata/properties" xmlns:ns3="41899fe1-77c8-4641-9c61-2479d8d6a5c3" xmlns:ns4="1ea4a77d-1883-4cde-a10e-daa02c7e237a" targetNamespace="http://schemas.microsoft.com/office/2006/metadata/properties" ma:root="true" ma:fieldsID="0137eca7c0fbe07db7b796e82e054778" ns3:_="" ns4:_="">
+    <xsd:import namespace="41899fe1-77c8-4641-9c61-2479d8d6a5c3"/>
+    <xsd:import namespace="1ea4a77d-1883-4cde-a10e-daa02c7e237a"/>
+    <xsd:element name="properties">
+      <xsd:complexType>
+        <xsd:sequence>
+          <xsd:element name="documentManagement">
+            <xsd:complexType>
+              <xsd:all>
+                <xsd:element ref="ns3:_activity" minOccurs="0"/>
+                <xsd:element ref="ns4:SharedWithUsers" minOccurs="0"/>
+                <xsd:element ref="ns4:SharedWithDetails" minOccurs="0"/>
+                <xsd:element ref="ns4:SharingHintHash" minOccurs="0"/>
+                <xsd:element ref="ns3:MediaServiceMetadata" minOccurs="0"/>
+                <xsd:element ref="ns3:MediaServiceFastMetadata" minOccurs="0"/>
+                <xsd:element ref="ns3:MediaServiceSearchProperties" minOccurs="0"/>
+                <xsd:element ref="ns3:MediaServiceObjectDetectorVersions" minOccurs="0"/>
+                <xsd:element ref="ns3:MediaServiceDateTaken" minOccurs="0"/>
+                <xsd:element ref="ns3:MediaServiceSystemTags" minOccurs="0"/>
+                <xsd:element ref="ns3:MediaServiceGenerationTime" minOccurs="0"/>
+                <xsd:element ref="ns3:MediaServiceEventHashCode" minOccurs="0"/>
+                <xsd:element ref="ns3:MediaLengthInSeconds" minOccurs="0"/>
+              </xsd:all>
+            </xsd:complexType>
+          </xsd:element>
+        </xsd:sequence>
+      </xsd:complexType>
+    </xsd:element>
+  </xsd:schema>
+  <xsd:schema xmlns:xsd="http://www.w3.org/2001/XMLSchema" xmlns:xs="http://www.w3.org/2001/XMLSchema" xmlns:dms="http://schemas.microsoft.com/office/2006/documentManagement/types" xmlns:pc="http://schemas.microsoft.com/office/infopath/2007/PartnerControls" targetNamespace="41899fe1-77c8-4641-9c61-2479d8d6a5c3" elementFormDefault="qualified">
+    <xsd:import namespace="http://schemas.microsoft.com/office/2006/documentManagement/types"/>
+    <xsd:import namespace="http://schemas.microsoft.com/office/infopath/2007/PartnerControls"/>
+    <xsd:element name="_activity" ma:index="8" nillable="true" ma:displayName="_activity" ma:hidden="true" ma:internalName="_activity">
+      <xsd:simpleType>
+        <xsd:restriction base="dms:Note"/>
+      </xsd:simpleType>
+    </xsd:element>
+    <xsd:element name="MediaServiceMetadata" ma:index="12" nillable="true" ma:displayName="MediaServiceMetadata" ma:hidden="true" ma:internalName="MediaServiceMetadata" ma:readOnly="true">
+      <xsd:simpleType>
+        <xsd:restriction base="dms:Note"/>
+      </xsd:simpleType>
+    </xsd:element>
+    <xsd:element name="MediaServiceFastMetadata" ma:index="13" nillable="true" ma:displayName="MediaServiceFastMetadata" ma:hidden="true" ma:internalName="MediaServiceFastMetadata" ma:readOnly="true">
+      <xsd:simpleType>
+        <xsd:restriction base="dms:Note"/>
+      </xsd:simpleType>
+    </xsd:element>
+    <xsd:element name="MediaServiceSearchProperties" ma:index="14" nillable="true" ma:displayName="MediaServiceSearchProperties" ma:hidden="true" ma:internalName="MediaServiceSearchProperties" ma:readOnly="true">
+      <xsd:simpleType>
+        <xsd:restriction base="dms:Note"/>
+      </xsd:simpleType>
+    </xsd:element>
+    <xsd:element name="MediaServiceObjectDetectorVersions" ma:index="15" nillable="true" ma:displayName="MediaServiceObjectDetectorVersions" ma:hidden="true" ma:indexed="true" ma:internalName="MediaServiceObjectDetectorVersions" ma:readOnly="true">
+      <xsd:simpleType>
+        <xsd:restriction base="dms:Text"/>
+      </xsd:simpleType>
+    </xsd:element>
+    <xsd:element name="MediaServiceDateTaken" ma:index="16" nillable="true" ma:displayName="MediaServiceDateTaken" ma:hidden="true" ma:indexed="true" ma:internalName="MediaServiceDateTaken" ma:readOnly="true">
+      <xsd:simpleType>
+        <xsd:restriction base="dms:Text"/>
+      </xsd:simpleType>
+    </xsd:element>
+    <xsd:element name="MediaServiceSystemTags" ma:index="17" nillable="true" ma:displayName="MediaServiceSystemTags" ma:hidden="true" ma:internalName="MediaServiceSystemTags" ma:readOnly="true">
+      <xsd:simpleType>
+        <xsd:restriction base="dms:Note"/>
+      </xsd:simpleType>
+    </xsd:element>
+    <xsd:element name="MediaServiceGenerationTime" ma:index="18" nillable="true" ma:displayName="MediaServiceGenerationTime" ma:hidden="true" ma:internalName="MediaServiceGenerationTime" ma:readOnly="true">
+      <xsd:simpleType>
+        <xsd:restriction base="dms:Text"/>
+      </xsd:simpleType>
+    </xsd:element>
+    <xsd:element name="MediaServiceEventHashCode" ma:index="19" nillable="true" ma:displayName="MediaServiceEventHashCode" ma:hidden="true" ma:internalName="MediaServiceEventHashCode" ma:readOnly="true">
+      <xsd:simpleType>
+        <xsd:restriction base="dms:Text"/>
+      </xsd:simpleType>
+    </xsd:element>
+    <xsd:element name="MediaLengthInSeconds" ma:index="20" nillable="true" ma:displayName="MediaLengthInSeconds" ma:hidden="true" ma:internalName="MediaLengthInSeconds" ma:readOnly="true">
+      <xsd:simpleType>
+        <xsd:restriction base="dms:Unknown"/>
+      </xsd:simpleType>
+    </xsd:element>
+  </xsd:schema>
+  <xsd:schema xmlns:xsd="http://www.w3.org/2001/XMLSchema" xmlns:xs="http://www.w3.org/2001/XMLSchema" xmlns:dms="http://schemas.microsoft.com/office/2006/documentManagement/types" xmlns:pc="http://schemas.microsoft.com/office/infopath/2007/PartnerControls" targetNamespace="1ea4a77d-1883-4cde-a10e-daa02c7e237a" elementFormDefault="qualified">
+    <xsd:import namespace="http://schemas.microsoft.com/office/2006/documentManagement/types"/>
+    <xsd:import namespace="http://schemas.microsoft.com/office/infopath/2007/PartnerControls"/>
+    <xsd:element name="SharedWithUsers" ma:index="9" nillable="true" ma:displayName="Shared With" ma:internalName="SharedWithUsers" ma:readOnly="true">
+      <xsd:complexType>
+        <xsd:complexContent>
+          <xsd:extension base="dms:UserMulti">
+            <xsd:sequence>
+              <xsd:element name="UserInfo" minOccurs="0" maxOccurs="unbounded">
+                <xsd:complexType>
+                  <xsd:sequence>
+                    <xsd:element name="DisplayName" type="xsd:string" minOccurs="0"/>
+                    <xsd:element name="AccountId" type="dms:UserId" minOccurs="0" nillable="true"/>
+                    <xsd:element name="AccountType" type="xsd:string" minOccurs="0"/>
+                  </xsd:sequence>
+                </xsd:complexType>
+              </xsd:element>
+            </xsd:sequence>
+          </xsd:extension>
+        </xsd:complexContent>
+      </xsd:complexType>
+    </xsd:element>
+    <xsd:element name="SharedWithDetails" ma:index="10" nillable="true" ma:displayName="Shared With Details" ma:internalName="SharedWithDetails" ma:readOnly="true">
+      <xsd:simpleType>
+        <xsd:restriction base="dms:Note">
+          <xsd:maxLength value="255"/>
+        </xsd:restriction>
+      </xsd:simpleType>
+    </xsd:element>
+    <xsd:element name="SharingHintHash" ma:index="11" nillable="true" ma:displayName="Sharing Hint Hash" ma:hidden="true" ma:internalName="SharingHintHash" ma:readOnly="true">
+      <xsd:simpleType>
+        <xsd:restriction base="dms:Text"/>
+      </xsd:simpleType>
+    </xsd:element>
+  </xsd:schema>
+  <xsd:schema xmlns="http://schemas.openxmlformats.org/package/2006/metadata/core-properties" xmlns:xsd="http://www.w3.org/2001/XMLSchema" xmlns:xsi="http://www.w3.org/2001/XMLSchema-instance" xmlns:dc="http://purl.org/dc/elements/1.1/" xmlns:dcterms="http://purl.org/dc/terms/" xmlns:odoc="http://schemas.microsoft.com/internal/obd" targetNamespace="http://schemas.openxmlformats.org/package/2006/metadata/core-properties" elementFormDefault="qualified" attributeFormDefault="unqualified" blockDefault="#all">
+    <xsd:import namespace="http://purl.org/dc/elements/1.1/" schemaLocation="http://dublincore.org/schemas/xmls/qdc/2003/04/02/dc.xsd"/>
+    <xsd:import namespace="http://purl.org/dc/terms/" schemaLocation="http://dublincore.org/schemas/xmls/qdc/2003/04/02/dcterms.xsd"/>
+    <xsd:element name="coreProperties" type="CT_coreProperties"/>
+    <xsd:complexType name="CT_coreProperties">
+      <xsd:all>
+        <xsd:element ref="dc:creator" minOccurs="0" maxOccurs="1"/>
+        <xsd:element ref="dcterms:created" minOccurs="0" maxOccurs="1"/>
+        <xsd:element ref="dc:identifier" minOccurs="0" maxOccurs="1"/>
+        <xsd:element name="contentType" minOccurs="0" maxOccurs="1" type="xsd:string" ma:index="0" ma:displayName="Content Type"/>
+        <xsd:element ref="dc:title" minOccurs="0" maxOccurs="1" ma:index="4" ma:displayName="Title"/>
+        <xsd:element ref="dc:subject" minOccurs="0" maxOccurs="1"/>
+        <xsd:element ref="dc:description" minOccurs="0" maxOccurs="1"/>
+        <xsd:element name="keywords" minOccurs="0" maxOccurs="1" type="xsd:string"/>
+        <xsd:element ref="dc:language" minOccurs="0" maxOccurs="1"/>
+        <xsd:element name="category" minOccurs="0" maxOccurs="1" type="xsd:string"/>
+        <xsd:element name="version" minOccurs="0" maxOccurs="1" type="xsd:string"/>
+        <xsd:element name="revision" minOccurs="0" maxOccurs="1" type="xsd:string">
+          <xsd:annotation>
+            <xsd:documentation>
+                        This value indicates the number of saves or revisions. The application is responsible for updating this value after each revision.
+                    </xsd:documentation>
+          </xsd:annotation>
+        </xsd:element>
+        <xsd:element name="lastModifiedBy" minOccurs="0" maxOccurs="1" type="xsd:string"/>
+        <xsd:element ref="dcterms:modified" minOccurs="0" maxOccurs="1"/>
+        <xsd:element name="contentStatus" minOccurs="0" maxOccurs="1" type="xsd:string"/>
+      </xsd:all>
+    </xsd:complexType>
+  </xsd:schema>
+  <xs:schema xmlns:pc="http://schemas.microsoft.com/office/infopath/2007/PartnerControls" xmlns:xs="http://www.w3.org/2001/XMLSchema" targetNamespace="http://schemas.microsoft.com/office/infopath/2007/PartnerControls" elementFormDefault="qualified" attributeFormDefault="unqualified">
+    <xs:element name="Person">
+      <xs:complexType>
+        <xs:sequence>
+          <xs:element ref="pc:DisplayName" minOccurs="0"/>
+          <xs:element ref="pc:AccountId" minOccurs="0"/>
+          <xs:element ref="pc:AccountType" minOccurs="0"/>
+        </xs:sequence>
+      </xs:complexType>
+    </xs:element>
+    <xs:element name="DisplayName" type="xs:string"/>
+    <xs:element name="AccountId" type="xs:string"/>
+    <xs:element name="AccountType" type="xs:string"/>
+    <xs:element name="BDCAssociatedEntity">
+      <xs:complexType>
+        <xs:sequence>
+          <xs:element ref="pc:BDCEntity" minOccurs="0" maxOccurs="unbounded"/>
+        </xs:sequence>
+        <xs:attribute ref="pc:EntityNamespace"/>
+        <xs:attribute ref="pc:EntityName"/>
+        <xs:attribute ref="pc:SystemInstanceName"/>
+        <xs:attribute ref="pc:AssociationName"/>
+      </xs:complexType>
+    </xs:element>
+    <xs:attribute name="EntityNamespace" type="xs:string"/>
+    <xs:attribute name="EntityName" type="xs:string"/>
+    <xs:attribute name="SystemInstanceName" type="xs:string"/>
+    <xs:attribute name="AssociationName" type="xs:string"/>
+    <xs:element name="BDCEntity">
+      <xs:complexType>
+        <xs:sequence>
+          <xs:element ref="pc:EntityDisplayName" minOccurs="0"/>
+          <xs:element ref="pc:EntityInstanceReference" minOccurs="0"/>
+          <xs:element ref="pc:EntityId1" minOccurs="0"/>
+          <xs:element ref="pc:EntityId2" minOccurs="0"/>
+          <xs:element ref="pc:EntityId3" minOccurs="0"/>
+          <xs:element ref="pc:EntityId4" minOccurs="0"/>
+          <xs:element ref="pc:EntityId5" minOccurs="0"/>
+        </xs:sequence>
+      </xs:complexType>
+    </xs:element>
+    <xs:element name="EntityDisplayName" type="xs:string"/>
+    <xs:element name="EntityInstanceReference" type="xs:string"/>
+    <xs:element name="EntityId1" type="xs:string"/>
+    <xs:element name="EntityId2" type="xs:string"/>
+    <xs:element name="EntityId3" type="xs:string"/>
+    <xs:element name="EntityId4" type="xs:string"/>
+    <xs:element name="EntityId5" type="xs:string"/>
+    <xs:element name="Terms">
+      <xs:complexType>
+        <xs:sequence>
+          <xs:element ref="pc:TermInfo" minOccurs="0" maxOccurs="unbounded"/>
+        </xs:sequence>
+      </xs:complexType>
+    </xs:element>
+    <xs:element name="TermInfo">
+      <xs:complexType>
+        <xs:sequence>
+          <xs:element ref="pc:TermName" minOccurs="0"/>
+          <xs:element ref="pc:TermId" minOccurs="0"/>
+        </xs:sequence>
+      </xs:complexType>
+    </xs:element>
+    <xs:element name="TermName" type="xs:string"/>
+    <xs:element name="TermId" type="xs:string"/>
+  </xs:schema>
+</ct:contentTypeSchema>
+</file>
+
+<file path=customXml/item3.xml><?xml version="1.0" encoding="utf-8"?>
+<?mso-contentType ?>
+<FormTemplates xmlns="http://schemas.microsoft.com/sharepoint/v3/contenttype/forms">
+  <Display>DocumentLibraryForm</Display>
+  <Edit>DocumentLibraryForm</Edit>
+  <New>DocumentLibraryForm</New>
+</FormTemplates>
+</file>
+
+<file path=customXml/item4.xml><?xml version="1.0" encoding="utf-8"?>
+<p:properties xmlns:p="http://schemas.microsoft.com/office/2006/metadata/properties" xmlns:xsi="http://www.w3.org/2001/XMLSchema-instance" xmlns:pc="http://schemas.microsoft.com/office/infopath/2007/PartnerControls">
+  <documentManagement>
+    <_activity xmlns="41899fe1-77c8-4641-9c61-2479d8d6a5c3" xsi:nil="true"/>
+  </documentManagement>
+</p:properties>
+</file>
+
 <file path=customXml/itemProps1.xml><?xml version="1.0" encoding="utf-8"?>
 <ds:datastoreItem xmlns:ds="http://schemas.openxmlformats.org/officeDocument/2006/customXml" ds:itemID="{2FE9F069-7E3B-4999-BDB4-6CFBEF60BDB2}">
   <ds:schemaRefs>
     <ds:schemaRef ds:uri="http://schemas.openxmlformats.org/officeDocument/2006/bibliography"/>
   </ds:schemaRefs>
 </ds:datastoreItem>
+</file>
+
+<file path=customXml/itemProps2.xml><?xml version="1.0" encoding="utf-8"?>
+<ds:datastoreItem xmlns:ds="http://schemas.openxmlformats.org/officeDocument/2006/customXml" ds:itemID="{1BF364A2-442E-42B4-8376-A85B7B804494}">
+  <ds:schemaRefs>
+    <ds:schemaRef ds:uri="http://schemas.microsoft.com/office/2006/metadata/contentType"/>
+    <ds:schemaRef ds:uri="http://schemas.microsoft.com/office/2006/metadata/properties/metaAttributes"/>
+    <ds:schemaRef ds:uri="http://www.w3.org/2001/XMLSchema"/>
+    <ds:schemaRef ds:uri="http://schemas.microsoft.com/office/2006/metadata/properties"/>
+    <ds:schemaRef ds:uri="41899fe1-77c8-4641-9c61-2479d8d6a5c3"/>
+    <ds:schemaRef ds:uri="1ea4a77d-1883-4cde-a10e-daa02c7e237a"/>
+    <ds:schemaRef ds:uri="http://schemas.microsoft.com/office/2006/documentManagement/types"/>
+    <ds:schemaRef ds:uri="http://schemas.microsoft.com/office/infopath/2007/PartnerControls"/>
+    <ds:schemaRef ds:uri="http://schemas.openxmlformats.org/package/2006/metadata/core-properties"/>
+    <ds:schemaRef ds:uri="http://purl.org/dc/elements/1.1/"/>
+    <ds:schemaRef ds:uri="http://purl.org/dc/terms/"/>
+    <ds:schemaRef ds:uri="http://schemas.microsoft.com/internal/obd"/>
+  </ds:schemaRefs>
+</ds:datastoreItem>
+</file>
+
+<file path=customXml/itemProps3.xml><?xml version="1.0" encoding="utf-8"?>
+<ds:datastoreItem xmlns:ds="http://schemas.openxmlformats.org/officeDocument/2006/customXml" ds:itemID="{5847AE6C-A735-4F82-8390-881A7356A6D0}">
+  <ds:schemaRefs>
+    <ds:schemaRef ds:uri="http://schemas.microsoft.com/sharepoint/v3/contenttype/forms"/>
+  </ds:schemaRefs>
+</ds:datastoreItem>
+</file>
+
+<file path=customXml/itemProps4.xml><?xml version="1.0" encoding="utf-8"?>
+<ds:datastoreItem xmlns:ds="http://schemas.openxmlformats.org/officeDocument/2006/customXml" ds:itemID="{00EF1867-B8E5-4405-80C2-3FC71709F8B3}">
+  <ds:schemaRefs>
+    <ds:schemaRef ds:uri="http://schemas.microsoft.com/office/2006/metadata/properties"/>
+    <ds:schemaRef ds:uri="http://schemas.microsoft.com/office/infopath/2007/PartnerControls"/>
+    <ds:schemaRef ds:uri="41899fe1-77c8-4641-9c61-2479d8d6a5c3"/>
+  </ds:schemaRefs>
+</ds:datastoreItem>
 </file>
</xml_diff>

<commit_message>
Insecure Direct Object Reference (IDOR)
</commit_message>
<xml_diff>
--- a/assiment.docx
+++ b/assiment.docx
@@ -124,6 +124,7 @@
         </w:rPr>
         <w:t xml:space="preserve"> </w:t>
       </w:r>
+      <w:proofErr w:type="spellStart"/>
       <w:r>
         <w:rPr>
           <w:b/>
@@ -131,6 +132,7 @@
         </w:rPr>
         <w:t>DevSecOps</w:t>
       </w:r>
+      <w:proofErr w:type="spellEnd"/>
     </w:p>
     <w:p>
       <w:pPr>
@@ -278,8 +280,13 @@
               <w:spacing w:after="160" w:line="278" w:lineRule="auto"/>
             </w:pPr>
             <w:r>
-              <w:t>Pethvan p p</w:t>
-            </w:r>
+              <w:t xml:space="preserve">Pethvan p </w:t>
+            </w:r>
+            <w:proofErr w:type="spellStart"/>
+            <w:r>
+              <w:t>p</w:t>
+            </w:r>
+            <w:proofErr w:type="spellEnd"/>
           </w:p>
         </w:tc>
       </w:tr>
@@ -323,8 +330,13 @@
             <w:pPr>
               <w:spacing w:after="160" w:line="278" w:lineRule="auto"/>
             </w:pPr>
-            <w:r>
-              <w:t xml:space="preserve">Aluthge </w:t>
+            <w:proofErr w:type="spellStart"/>
+            <w:r>
+              <w:t>Aluthge</w:t>
+            </w:r>
+            <w:proofErr w:type="spellEnd"/>
+            <w:r>
+              <w:t xml:space="preserve"> </w:t>
             </w:r>
             <w:proofErr w:type="gramStart"/>
             <w:r>
@@ -425,8 +437,13 @@
             <w:pPr>
               <w:spacing w:after="160" w:line="278" w:lineRule="auto"/>
             </w:pPr>
-            <w:r>
-              <w:t>Shanthoshika S</w:t>
+            <w:proofErr w:type="spellStart"/>
+            <w:r>
+              <w:t>Shanthoshika</w:t>
+            </w:r>
+            <w:proofErr w:type="spellEnd"/>
+            <w:r>
+              <w:t xml:space="preserve"> S</w:t>
             </w:r>
           </w:p>
         </w:tc>
@@ -1189,14 +1206,27 @@
         <w:pStyle w:val="Heading2"/>
       </w:pPr>
       <w:bookmarkStart w:id="1" w:name="_Toc241006666"/>
-      <w:r>
-        <w:t>Multiocintainer stack</w:t>
+      <w:proofErr w:type="spellStart"/>
+      <w:r>
+        <w:t>Multiocintainer</w:t>
+      </w:r>
+      <w:proofErr w:type="spellEnd"/>
+      <w:r>
+        <w:t xml:space="preserve"> stack</w:t>
       </w:r>
       <w:bookmarkEnd w:id="1"/>
     </w:p>
     <w:p>
       <w:r>
-        <w:t xml:space="preserve">The deployment architecture partitions OWASP NodeGoat into two discrete containerized tiers </w:t>
+        <w:t xml:space="preserve">The deployment architecture partitions OWASP </w:t>
+      </w:r>
+      <w:proofErr w:type="spellStart"/>
+      <w:r>
+        <w:t>NodeGoat</w:t>
+      </w:r>
+      <w:proofErr w:type="spellEnd"/>
+      <w:r>
+        <w:t xml:space="preserve"> into two discrete containerized tiers </w:t>
       </w:r>
     </w:p>
     <w:p>
@@ -1208,7 +1238,15 @@
         </w:numPr>
       </w:pPr>
       <w:r>
-        <w:t>The application runtime tier(nodegoat-web)</w:t>
+        <w:t>The application runtime tier(</w:t>
+      </w:r>
+      <w:proofErr w:type="spellStart"/>
+      <w:r>
+        <w:t>nodegoat</w:t>
+      </w:r>
+      <w:proofErr w:type="spellEnd"/>
+      <w:r>
+        <w:t>-web)</w:t>
       </w:r>
     </w:p>
     <w:p>
@@ -1228,12 +1266,28 @@
       </w:r>
       <w:proofErr w:type="gramEnd"/>
       <w:r>
-        <w:t>(nodegoat-db)</w:t>
-      </w:r>
-    </w:p>
-    <w:p>
-      <w:r>
-        <w:t xml:space="preserve">Using docker compose the system build and start in fully self container offline status single command </w:t>
+        <w:t>(</w:t>
+      </w:r>
+      <w:proofErr w:type="spellStart"/>
+      <w:r>
+        <w:t>nodegoat-db</w:t>
+      </w:r>
+      <w:proofErr w:type="spellEnd"/>
+      <w:r>
+        <w:t>)</w:t>
+      </w:r>
+    </w:p>
+    <w:p>
+      <w:r>
+        <w:t xml:space="preserve">Using docker compose the system build and start in fully </w:t>
+      </w:r>
+      <w:proofErr w:type="spellStart"/>
+      <w:r>
+        <w:t>self container</w:t>
+      </w:r>
+      <w:proofErr w:type="spellEnd"/>
+      <w:r>
+        <w:t xml:space="preserve"> offline status single command </w:t>
       </w:r>
       <w:r>
         <w:rPr>
@@ -1251,7 +1305,31 @@
       </w:r>
       <w:proofErr w:type="gramEnd"/>
       <w:r>
-        <w:t xml:space="preserve"> express application handling and isolated mongo-db database management manage in db docker using tcp port 27017 for monitoring scripts and logs</w:t>
+        <w:t xml:space="preserve"> express application handling and isolated mongo-</w:t>
+      </w:r>
+      <w:proofErr w:type="spellStart"/>
+      <w:r>
+        <w:t>db</w:t>
+      </w:r>
+      <w:proofErr w:type="spellEnd"/>
+      <w:r>
+        <w:t xml:space="preserve"> database management manage in </w:t>
+      </w:r>
+      <w:proofErr w:type="spellStart"/>
+      <w:r>
+        <w:t>db</w:t>
+      </w:r>
+      <w:proofErr w:type="spellEnd"/>
+      <w:r>
+        <w:t xml:space="preserve"> docker using </w:t>
+      </w:r>
+      <w:proofErr w:type="spellStart"/>
+      <w:r>
+        <w:t>tcp</w:t>
+      </w:r>
+      <w:proofErr w:type="spellEnd"/>
+      <w:r>
+        <w:t xml:space="preserve"> port 27017 for monitoring scripts and logs</w:t>
       </w:r>
     </w:p>
     <w:p>
@@ -1394,6 +1472,7 @@
       <w:r>
         <w:t xml:space="preserve">configure with </w:t>
       </w:r>
+      <w:proofErr w:type="spellStart"/>
       <w:proofErr w:type="gramStart"/>
       <w:r>
         <w:rPr>
@@ -1402,6 +1481,7 @@
         </w:rPr>
         <w:t>internal:true</w:t>
       </w:r>
+      <w:proofErr w:type="spellEnd"/>
       <w:proofErr w:type="gramEnd"/>
       <w:r>
         <w:t xml:space="preserve"> to </w:t>
@@ -1651,8 +1731,13 @@
       </w:r>
       <w:proofErr w:type="gramStart"/>
       <w:r>
-        <w:t>the NodeGoat</w:t>
-      </w:r>
+        <w:t xml:space="preserve">the </w:t>
+      </w:r>
+      <w:proofErr w:type="spellStart"/>
+      <w:r>
+        <w:t>NodeGoat</w:t>
+      </w:r>
+      <w:proofErr w:type="spellEnd"/>
       <w:proofErr w:type="gramEnd"/>
       <w:r>
         <w:t xml:space="preserve"> architecture. The threats were identified using the STRIDE methodology.</w:t>
@@ -1703,7 +1788,15 @@
       </w:r>
       <w:proofErr w:type="gramEnd"/>
       <w:r>
-        <w:t xml:space="preserve"> taking advantage of the fact that Express does not enforce typechecking on the input, the attacker can bypass authentication and hijack an administrator’s session. No credentials would be required to perform this attack, apart from basic knowledge of the MongoDB query language.</w:t>
+        <w:t xml:space="preserve"> taking advantage of the fact that Express does not enforce </w:t>
+      </w:r>
+      <w:proofErr w:type="spellStart"/>
+      <w:r>
+        <w:t>typechecking</w:t>
+      </w:r>
+      <w:proofErr w:type="spellEnd"/>
+      <w:r>
+        <w:t xml:space="preserve"> on the input, the attacker can bypass authentication and hijack an administrator’s session. No credentials would be required to perform this attack, apart from basic knowledge of the MongoDB query language.</w:t>
       </w:r>
     </w:p>
     <w:p>
@@ -1722,7 +1815,23 @@
         <w:t>Tampering (Insecure Direct Object Reference on Allocations):</w:t>
       </w:r>
       <w:r>
-        <w:t xml:space="preserve"> An authenticated attacker can tamper with allocation records by modifying the request sent to the server when the attacker attempts to update their asset allocation. By changing the userId value in the request to another value, the attacker can effectively change the allocation records of another user. The vulnerability stems from the fact that the server does not check whether the userId belongs to the authenticated attacker.</w:t>
+        <w:t xml:space="preserve"> An authenticated attacker can tamper with allocation records by modifying the request sent to the server when the attacker attempts to update their asset allocation. By changing the </w:t>
+      </w:r>
+      <w:proofErr w:type="spellStart"/>
+      <w:r>
+        <w:t>userId</w:t>
+      </w:r>
+      <w:proofErr w:type="spellEnd"/>
+      <w:r>
+        <w:t xml:space="preserve"> value in the request to another value, the attacker can effectively change the allocation records of another user. The vulnerability stems from the fact that the server does not check whether the </w:t>
+      </w:r>
+      <w:proofErr w:type="spellStart"/>
+      <w:r>
+        <w:t>userId</w:t>
+      </w:r>
+      <w:proofErr w:type="spellEnd"/>
+      <w:r>
+        <w:t xml:space="preserve"> belongs to the authenticated attacker.</w:t>
       </w:r>
     </w:p>
     <w:p>
@@ -1741,7 +1850,15 @@
         <w:t>Information Disclosure (Hardcoded Database Credentials):</w:t>
       </w:r>
       <w:r>
-        <w:t xml:space="preserve"> A developer could accidentally commit the database credentials required to connect to the MongoDB server and sign cookies for the Express framework in the config/env/development.js file or the docker-compose.yml file. If this information becomes available to an attacker, they can utilize it to connect to the database directly and forge valid session cookies to hijack the administrator’s session.</w:t>
+        <w:t xml:space="preserve"> A developer could accidentally commit the database credentials required to connect to the MongoDB server and sign cookies for the Express framework in the config/env/development.js file or the docker-</w:t>
+      </w:r>
+      <w:proofErr w:type="spellStart"/>
+      <w:r>
+        <w:t>compose.yml</w:t>
+      </w:r>
+      <w:proofErr w:type="spellEnd"/>
+      <w:r>
+        <w:t xml:space="preserve"> file. If this information becomes available to an attacker, they can utilize it to connect to the database directly and forge valid session cookies to hijack the administrator’s session.</w:t>
       </w:r>
     </w:p>
     <w:p>
@@ -2215,6 +2332,7 @@
             <w:r>
               <w:t xml:space="preserve"> Implement strict allow-list type checking (</w:t>
             </w:r>
+            <w:proofErr w:type="spellStart"/>
             <w:proofErr w:type="gramStart"/>
             <w:r>
               <w:rPr>
@@ -2223,6 +2341,7 @@
               </w:rPr>
               <w:t>typeof</w:t>
             </w:r>
+            <w:proofErr w:type="spellEnd"/>
             <w:proofErr w:type="gramEnd"/>
             <w:r>
               <w:rPr>
@@ -2320,6 +2439,7 @@
               </w:rPr>
               <w:t xml:space="preserve"> </w:t>
             </w:r>
+            <w:proofErr w:type="spellStart"/>
             <w:proofErr w:type="gramStart"/>
             <w:r>
               <w:rPr>
@@ -2336,6 +2456,7 @@
               </w:rPr>
               <w:t>.userId</w:t>
             </w:r>
+            <w:proofErr w:type="spellEnd"/>
           </w:p>
         </w:tc>
         <w:tc>
@@ -2432,8 +2553,33 @@
                 <w:b/>
                 <w:bCs/>
               </w:rPr>
-              <w:t>.github/workflows/devsecops-pipeline.yml</w:t>
-            </w:r>
+              <w:t>.</w:t>
+            </w:r>
+            <w:proofErr w:type="spellStart"/>
+            <w:r>
+              <w:rPr>
+                <w:b/>
+                <w:bCs/>
+              </w:rPr>
+              <w:t>github</w:t>
+            </w:r>
+            <w:proofErr w:type="spellEnd"/>
+            <w:r>
+              <w:rPr>
+                <w:b/>
+                <w:bCs/>
+              </w:rPr>
+              <w:t>/workflows/</w:t>
+            </w:r>
+            <w:proofErr w:type="spellStart"/>
+            <w:r>
+              <w:rPr>
+                <w:b/>
+                <w:bCs/>
+              </w:rPr>
+              <w:t>devsecops-pipeline.yml</w:t>
+            </w:r>
+            <w:proofErr w:type="spellEnd"/>
           </w:p>
         </w:tc>
       </w:tr>
@@ -2481,15 +2627,32 @@
               <w:t>SAST &amp; Infrastructure Hardening</w:t>
             </w:r>
             <w:r>
-              <w:t xml:space="preserve">: Semgrep flags missing limits; </w:t>
-            </w:r>
+              <w:t xml:space="preserve">: </w:t>
+            </w:r>
+            <w:proofErr w:type="spellStart"/>
+            <w:r>
+              <w:t>Semgrep</w:t>
+            </w:r>
+            <w:proofErr w:type="spellEnd"/>
+            <w:r>
+              <w:t xml:space="preserve"> flags missing limits; </w:t>
+            </w:r>
+            <w:proofErr w:type="spellStart"/>
             <w:proofErr w:type="gramStart"/>
             <w:r>
               <w:rPr>
                 <w:b/>
                 <w:bCs/>
               </w:rPr>
-              <w:t>express.json({ limit</w:t>
+              <w:t>express.json</w:t>
+            </w:r>
+            <w:proofErr w:type="spellEnd"/>
+            <w:r>
+              <w:rPr>
+                <w:b/>
+                <w:bCs/>
+              </w:rPr>
+              <w:t>({ limit</w:t>
             </w:r>
             <w:proofErr w:type="gramEnd"/>
             <w:r>
@@ -2536,8 +2699,33 @@
                 <w:b/>
                 <w:bCs/>
               </w:rPr>
-              <w:t>.github/workflows/devsecops-pipeline.yml</w:t>
-            </w:r>
+              <w:t>.</w:t>
+            </w:r>
+            <w:proofErr w:type="spellStart"/>
+            <w:r>
+              <w:rPr>
+                <w:b/>
+                <w:bCs/>
+              </w:rPr>
+              <w:t>github</w:t>
+            </w:r>
+            <w:proofErr w:type="spellEnd"/>
+            <w:r>
+              <w:rPr>
+                <w:b/>
+                <w:bCs/>
+              </w:rPr>
+              <w:t>/workflows/</w:t>
+            </w:r>
+            <w:proofErr w:type="spellStart"/>
+            <w:r>
+              <w:rPr>
+                <w:b/>
+                <w:bCs/>
+              </w:rPr>
+              <w:t>devsecops-pipeline.yml</w:t>
+            </w:r>
+            <w:proofErr w:type="spellEnd"/>
           </w:p>
         </w:tc>
       </w:tr>
@@ -3175,8 +3363,248 @@
         <w:br w:type="textWrapping" w:clear="all"/>
       </w:r>
     </w:p>
+    <w:p>
+      <w:pPr>
+        <w:pStyle w:val="Heading2"/>
+      </w:pPr>
+      <w:r>
+        <w:t>Insecure Direct Object Reference (IDOR)</w:t>
+      </w:r>
+    </w:p>
+    <w:p>
+      <w:pPr>
+        <w:pStyle w:val="Heading3"/>
+      </w:pPr>
+      <w:r>
+        <w:t>Vulnerabilities</w:t>
+      </w:r>
+    </w:p>
+    <w:p>
+      <w:r>
+        <w:rPr>
+          <w:noProof/>
+        </w:rPr>
+        <w:drawing>
+          <wp:inline distT="0" distB="0" distL="0" distR="0" wp14:anchorId="300EC5AA" wp14:editId="1362F59F">
+            <wp:extent cx="5943600" cy="1972945"/>
+            <wp:effectExtent l="0" t="0" r="0" b="8255"/>
+            <wp:docPr id="217269298" name="Picture 1"/>
+            <wp:cNvGraphicFramePr>
+              <a:graphicFrameLocks xmlns:a="http://schemas.openxmlformats.org/drawingml/2006/main" noChangeAspect="1"/>
+            </wp:cNvGraphicFramePr>
+            <a:graphic xmlns:a="http://schemas.openxmlformats.org/drawingml/2006/main">
+              <a:graphicData uri="http://schemas.openxmlformats.org/drawingml/2006/picture">
+                <pic:pic xmlns:pic="http://schemas.openxmlformats.org/drawingml/2006/picture">
+                  <pic:nvPicPr>
+                    <pic:cNvPr id="217269298" name=""/>
+                    <pic:cNvPicPr/>
+                  </pic:nvPicPr>
+                  <pic:blipFill>
+                    <a:blip r:embed="rId27"/>
+                    <a:stretch>
+                      <a:fillRect/>
+                    </a:stretch>
+                  </pic:blipFill>
+                  <pic:spPr>
+                    <a:xfrm>
+                      <a:off x="0" y="0"/>
+                      <a:ext cx="5943600" cy="1972945"/>
+                    </a:xfrm>
+                    <a:prstGeom prst="rect">
+                      <a:avLst/>
+                    </a:prstGeom>
+                  </pic:spPr>
+                </pic:pic>
+              </a:graphicData>
+            </a:graphic>
+          </wp:inline>
+        </w:drawing>
+      </w:r>
+    </w:p>
+    <w:p>
+      <w:r>
+        <w:lastRenderedPageBreak/>
+        <w:drawing>
+          <wp:inline distT="0" distB="0" distL="0" distR="0" wp14:anchorId="1DAE04AE" wp14:editId="0F3F266C">
+            <wp:extent cx="5943600" cy="1722120"/>
+            <wp:effectExtent l="0" t="0" r="0" b="0"/>
+            <wp:docPr id="1093394965" name="Picture 1"/>
+            <wp:cNvGraphicFramePr>
+              <a:graphicFrameLocks xmlns:a="http://schemas.openxmlformats.org/drawingml/2006/main" noChangeAspect="1"/>
+            </wp:cNvGraphicFramePr>
+            <a:graphic xmlns:a="http://schemas.openxmlformats.org/drawingml/2006/main">
+              <a:graphicData uri="http://schemas.openxmlformats.org/drawingml/2006/picture">
+                <pic:pic xmlns:pic="http://schemas.openxmlformats.org/drawingml/2006/picture">
+                  <pic:nvPicPr>
+                    <pic:cNvPr id="1093394965" name=""/>
+                    <pic:cNvPicPr/>
+                  </pic:nvPicPr>
+                  <pic:blipFill>
+                    <a:blip r:embed="rId28"/>
+                    <a:stretch>
+                      <a:fillRect/>
+                    </a:stretch>
+                  </pic:blipFill>
+                  <pic:spPr>
+                    <a:xfrm>
+                      <a:off x="0" y="0"/>
+                      <a:ext cx="5943600" cy="1722120"/>
+                    </a:xfrm>
+                    <a:prstGeom prst="rect">
+                      <a:avLst/>
+                    </a:prstGeom>
+                  </pic:spPr>
+                </pic:pic>
+              </a:graphicData>
+            </a:graphic>
+          </wp:inline>
+        </w:drawing>
+      </w:r>
+    </w:p>
+    <w:p>
+      <w:r>
+        <w:t>app/routes/allocations.js</w:t>
+      </w:r>
+    </w:p>
+    <w:p>
+      <w:r>
+        <w:drawing>
+          <wp:inline distT="0" distB="0" distL="0" distR="0" wp14:anchorId="72AD8F4A" wp14:editId="5FE6ECB5">
+            <wp:extent cx="5943600" cy="3677285"/>
+            <wp:effectExtent l="0" t="0" r="0" b="0"/>
+            <wp:docPr id="1010118256" name="Picture 1"/>
+            <wp:cNvGraphicFramePr>
+              <a:graphicFrameLocks xmlns:a="http://schemas.openxmlformats.org/drawingml/2006/main" noChangeAspect="1"/>
+            </wp:cNvGraphicFramePr>
+            <a:graphic xmlns:a="http://schemas.openxmlformats.org/drawingml/2006/main">
+              <a:graphicData uri="http://schemas.openxmlformats.org/drawingml/2006/picture">
+                <pic:pic xmlns:pic="http://schemas.openxmlformats.org/drawingml/2006/picture">
+                  <pic:nvPicPr>
+                    <pic:cNvPr id="1010118256" name=""/>
+                    <pic:cNvPicPr/>
+                  </pic:nvPicPr>
+                  <pic:blipFill>
+                    <a:blip r:embed="rId29"/>
+                    <a:stretch>
+                      <a:fillRect/>
+                    </a:stretch>
+                  </pic:blipFill>
+                  <pic:spPr>
+                    <a:xfrm>
+                      <a:off x="0" y="0"/>
+                      <a:ext cx="5943600" cy="3677285"/>
+                    </a:xfrm>
+                    <a:prstGeom prst="rect">
+                      <a:avLst/>
+                    </a:prstGeom>
+                  </pic:spPr>
+                </pic:pic>
+              </a:graphicData>
+            </a:graphic>
+          </wp:inline>
+        </w:drawing>
+      </w:r>
+    </w:p>
+    <w:p>
+      <w:pPr>
+        <w:pStyle w:val="Heading3"/>
+      </w:pPr>
+      <w:r>
+        <w:t>Fix</w:t>
+      </w:r>
+    </w:p>
+    <w:p/>
+    <w:p/>
+    <w:p/>
+    <w:p>
+      <w:r>
+        <w:drawing>
+          <wp:inline distT="0" distB="0" distL="0" distR="0" wp14:anchorId="1F4953C6" wp14:editId="77A6A450">
+            <wp:extent cx="5943600" cy="737235"/>
+            <wp:effectExtent l="0" t="0" r="0" b="5715"/>
+            <wp:docPr id="780621007" name="Picture 1"/>
+            <wp:cNvGraphicFramePr>
+              <a:graphicFrameLocks xmlns:a="http://schemas.openxmlformats.org/drawingml/2006/main" noChangeAspect="1"/>
+            </wp:cNvGraphicFramePr>
+            <a:graphic xmlns:a="http://schemas.openxmlformats.org/drawingml/2006/main">
+              <a:graphicData uri="http://schemas.openxmlformats.org/drawingml/2006/picture">
+                <pic:pic xmlns:pic="http://schemas.openxmlformats.org/drawingml/2006/picture">
+                  <pic:nvPicPr>
+                    <pic:cNvPr id="780621007" name=""/>
+                    <pic:cNvPicPr/>
+                  </pic:nvPicPr>
+                  <pic:blipFill>
+                    <a:blip r:embed="rId30"/>
+                    <a:stretch>
+                      <a:fillRect/>
+                    </a:stretch>
+                  </pic:blipFill>
+                  <pic:spPr>
+                    <a:xfrm>
+                      <a:off x="0" y="0"/>
+                      <a:ext cx="5943600" cy="737235"/>
+                    </a:xfrm>
+                    <a:prstGeom prst="rect">
+                      <a:avLst/>
+                    </a:prstGeom>
+                  </pic:spPr>
+                </pic:pic>
+              </a:graphicData>
+            </a:graphic>
+          </wp:inline>
+        </w:drawing>
+      </w:r>
+    </w:p>
+    <w:p>
+      <w:r>
+        <w:lastRenderedPageBreak/>
+        <w:t>app/routes/allocations.js</w:t>
+      </w:r>
+    </w:p>
+    <w:p>
+      <w:r>
+        <w:drawing>
+          <wp:inline distT="0" distB="0" distL="0" distR="0" wp14:anchorId="08BB9BB7" wp14:editId="591F3F9F">
+            <wp:extent cx="5943600" cy="3065145"/>
+            <wp:effectExtent l="0" t="0" r="0" b="1905"/>
+            <wp:docPr id="549100626" name="Picture 1"/>
+            <wp:cNvGraphicFramePr>
+              <a:graphicFrameLocks xmlns:a="http://schemas.openxmlformats.org/drawingml/2006/main" noChangeAspect="1"/>
+            </wp:cNvGraphicFramePr>
+            <a:graphic xmlns:a="http://schemas.openxmlformats.org/drawingml/2006/main">
+              <a:graphicData uri="http://schemas.openxmlformats.org/drawingml/2006/picture">
+                <pic:pic xmlns:pic="http://schemas.openxmlformats.org/drawingml/2006/picture">
+                  <pic:nvPicPr>
+                    <pic:cNvPr id="549100626" name=""/>
+                    <pic:cNvPicPr/>
+                  </pic:nvPicPr>
+                  <pic:blipFill>
+                    <a:blip r:embed="rId31"/>
+                    <a:stretch>
+                      <a:fillRect/>
+                    </a:stretch>
+                  </pic:blipFill>
+                  <pic:spPr>
+                    <a:xfrm>
+                      <a:off x="0" y="0"/>
+                      <a:ext cx="5943600" cy="3065145"/>
+                    </a:xfrm>
+                    <a:prstGeom prst="rect">
+                      <a:avLst/>
+                    </a:prstGeom>
+                  </pic:spPr>
+                </pic:pic>
+              </a:graphicData>
+            </a:graphic>
+          </wp:inline>
+        </w:drawing>
+      </w:r>
+    </w:p>
+    <w:p/>
+    <w:p/>
+    <w:p/>
     <w:sectPr>
-      <w:footerReference w:type="default" r:id="rId27"/>
+      <w:footerReference w:type="default" r:id="rId32"/>
       <w:pgSz w:w="12240" w:h="15840"/>
       <w:pgMar w:top="1440" w:right="1440" w:bottom="1440" w:left="1440" w:header="720" w:footer="720" w:gutter="0"/>
       <w:pgNumType w:fmt="numberInDash" w:start="1"/>

</xml_diff>

<commit_message>
Insecure Cryptographic Storage (Plaintext Passwords)
</commit_message>
<xml_diff>
--- a/assiment.docx
+++ b/assiment.docx
@@ -124,6 +124,7 @@
         </w:rPr>
         <w:t xml:space="preserve"> </w:t>
       </w:r>
+      <w:proofErr w:type="spellStart"/>
       <w:r>
         <w:rPr>
           <w:b/>
@@ -131,6 +132,7 @@
         </w:rPr>
         <w:t>DevSecOps</w:t>
       </w:r>
+      <w:proofErr w:type="spellEnd"/>
     </w:p>
     <w:p>
       <w:pPr>
@@ -278,8 +280,13 @@
               <w:spacing w:after="160" w:line="278" w:lineRule="auto"/>
             </w:pPr>
             <w:r>
-              <w:t>Pethvan p p</w:t>
-            </w:r>
+              <w:t xml:space="preserve">Pethvan p </w:t>
+            </w:r>
+            <w:proofErr w:type="spellStart"/>
+            <w:r>
+              <w:t>p</w:t>
+            </w:r>
+            <w:proofErr w:type="spellEnd"/>
           </w:p>
         </w:tc>
       </w:tr>
@@ -323,9 +330,19 @@
             <w:pPr>
               <w:spacing w:after="160" w:line="278" w:lineRule="auto"/>
             </w:pPr>
-            <w:r>
-              <w:t>Aluthge M.N</w:t>
-            </w:r>
+            <w:proofErr w:type="spellStart"/>
+            <w:r>
+              <w:t>Aluthge</w:t>
+            </w:r>
+            <w:proofErr w:type="spellEnd"/>
+            <w:r>
+              <w:t xml:space="preserve"> </w:t>
+            </w:r>
+            <w:proofErr w:type="gramStart"/>
+            <w:r>
+              <w:t>M.N</w:t>
+            </w:r>
+            <w:proofErr w:type="gramEnd"/>
           </w:p>
         </w:tc>
       </w:tr>
@@ -370,8 +387,13 @@
               <w:spacing w:after="160" w:line="278" w:lineRule="auto"/>
             </w:pPr>
             <w:r>
-              <w:t>Adithya E.A.D.D.D</w:t>
-            </w:r>
+              <w:t>Adithya E.A.D.</w:t>
+            </w:r>
+            <w:proofErr w:type="gramStart"/>
+            <w:r>
+              <w:t>D.D</w:t>
+            </w:r>
+            <w:proofErr w:type="gramEnd"/>
           </w:p>
         </w:tc>
       </w:tr>
@@ -415,8 +437,13 @@
             <w:pPr>
               <w:spacing w:after="160" w:line="278" w:lineRule="auto"/>
             </w:pPr>
-            <w:r>
-              <w:t>Shanthoshika S</w:t>
+            <w:proofErr w:type="spellStart"/>
+            <w:r>
+              <w:t>Shanthoshika</w:t>
+            </w:r>
+            <w:proofErr w:type="spellEnd"/>
+            <w:r>
+              <w:t xml:space="preserve"> S</w:t>
             </w:r>
           </w:p>
         </w:tc>
@@ -487,7 +514,7 @@
           <w:r>
             <w:fldChar w:fldCharType="separate"/>
           </w:r>
-          <w:hyperlink w:anchor="_Toc241006665" w:history="1">
+          <w:hyperlink w:anchor="_Toc241090967" w:history="1">
             <w:r>
               <w:rPr>
                 <w:rStyle w:val="Hyperlink"/>
@@ -516,7 +543,7 @@
                 <w:noProof/>
                 <w:webHidden/>
               </w:rPr>
-              <w:instrText xml:space="preserve"> PAGEREF _Toc241006665 \h </w:instrText>
+              <w:instrText xml:space="preserve"> PAGEREF _Toc241090967 \h </w:instrText>
             </w:r>
             <w:r>
               <w:rPr>
@@ -562,7 +589,7 @@
               <w14:ligatures w14:val="standardContextual"/>
             </w:rPr>
           </w:pPr>
-          <w:hyperlink w:anchor="_Toc241006666" w:history="1">
+          <w:hyperlink w:anchor="_Toc241090968" w:history="1">
             <w:r>
               <w:rPr>
                 <w:rStyle w:val="Hyperlink"/>
@@ -589,7 +616,7 @@
                 <w:noProof/>
                 <w:webHidden/>
               </w:rPr>
-              <w:instrText xml:space="preserve"> PAGEREF _Toc241006666 \h </w:instrText>
+              <w:instrText xml:space="preserve"> PAGEREF _Toc241090968 \h </w:instrText>
             </w:r>
             <w:r>
               <w:rPr>
@@ -635,7 +662,7 @@
               <w14:ligatures w14:val="standardContextual"/>
             </w:rPr>
           </w:pPr>
-          <w:hyperlink w:anchor="_Toc241006667" w:history="1">
+          <w:hyperlink w:anchor="_Toc241090969" w:history="1">
             <w:r>
               <w:rPr>
                 <w:rStyle w:val="Hyperlink"/>
@@ -662,7 +689,7 @@
                 <w:noProof/>
                 <w:webHidden/>
               </w:rPr>
-              <w:instrText xml:space="preserve"> PAGEREF _Toc241006667 \h </w:instrText>
+              <w:instrText xml:space="preserve"> PAGEREF _Toc241090969 \h </w:instrText>
             </w:r>
             <w:r>
               <w:rPr>
@@ -708,7 +735,7 @@
               <w14:ligatures w14:val="standardContextual"/>
             </w:rPr>
           </w:pPr>
-          <w:hyperlink w:anchor="_Toc241006668" w:history="1">
+          <w:hyperlink w:anchor="_Toc241090970" w:history="1">
             <w:r>
               <w:rPr>
                 <w:rStyle w:val="Hyperlink"/>
@@ -735,7 +762,7 @@
                 <w:noProof/>
                 <w:webHidden/>
               </w:rPr>
-              <w:instrText xml:space="preserve"> PAGEREF _Toc241006668 \h </w:instrText>
+              <w:instrText xml:space="preserve"> PAGEREF _Toc241090970 \h </w:instrText>
             </w:r>
             <w:r>
               <w:rPr>
@@ -781,7 +808,7 @@
               <w14:ligatures w14:val="standardContextual"/>
             </w:rPr>
           </w:pPr>
-          <w:hyperlink w:anchor="_Toc241006669" w:history="1">
+          <w:hyperlink w:anchor="_Toc241090971" w:history="1">
             <w:r>
               <w:rPr>
                 <w:rStyle w:val="Hyperlink"/>
@@ -810,7 +837,7 @@
                 <w:noProof/>
                 <w:webHidden/>
               </w:rPr>
-              <w:instrText xml:space="preserve"> PAGEREF _Toc241006669 \h </w:instrText>
+              <w:instrText xml:space="preserve"> PAGEREF _Toc241090971 \h </w:instrText>
             </w:r>
             <w:r>
               <w:rPr>
@@ -856,7 +883,7 @@
               <w14:ligatures w14:val="standardContextual"/>
             </w:rPr>
           </w:pPr>
-          <w:hyperlink w:anchor="_Toc241006670" w:history="1">
+          <w:hyperlink w:anchor="_Toc241090972" w:history="1">
             <w:r>
               <w:rPr>
                 <w:rStyle w:val="Hyperlink"/>
@@ -883,7 +910,7 @@
                 <w:noProof/>
                 <w:webHidden/>
               </w:rPr>
-              <w:instrText xml:space="preserve"> PAGEREF _Toc241006670 \h </w:instrText>
+              <w:instrText xml:space="preserve"> PAGEREF _Toc241090972 \h </w:instrText>
             </w:r>
             <w:r>
               <w:rPr>
@@ -929,7 +956,7 @@
               <w14:ligatures w14:val="standardContextual"/>
             </w:rPr>
           </w:pPr>
-          <w:hyperlink w:anchor="_Toc241006671" w:history="1">
+          <w:hyperlink w:anchor="_Toc241090973" w:history="1">
             <w:r>
               <w:rPr>
                 <w:rStyle w:val="Hyperlink"/>
@@ -956,7 +983,7 @@
                 <w:noProof/>
                 <w:webHidden/>
               </w:rPr>
-              <w:instrText xml:space="preserve"> PAGEREF _Toc241006671 \h </w:instrText>
+              <w:instrText xml:space="preserve"> PAGEREF _Toc241090973 \h </w:instrText>
             </w:r>
             <w:r>
               <w:rPr>
@@ -1002,7 +1029,7 @@
               <w14:ligatures w14:val="standardContextual"/>
             </w:rPr>
           </w:pPr>
-          <w:hyperlink w:anchor="_Toc241006672" w:history="1">
+          <w:hyperlink w:anchor="_Toc241090974" w:history="1">
             <w:r>
               <w:rPr>
                 <w:rStyle w:val="Hyperlink"/>
@@ -1029,7 +1056,7 @@
                 <w:noProof/>
                 <w:webHidden/>
               </w:rPr>
-              <w:instrText xml:space="preserve"> PAGEREF _Toc241006672 \h </w:instrText>
+              <w:instrText xml:space="preserve"> PAGEREF _Toc241090974 \h </w:instrText>
             </w:r>
             <w:r>
               <w:rPr>
@@ -1075,7 +1102,7 @@
               <w14:ligatures w14:val="standardContextual"/>
             </w:rPr>
           </w:pPr>
-          <w:hyperlink w:anchor="_Toc241006673" w:history="1">
+          <w:hyperlink w:anchor="_Toc241090975" w:history="1">
             <w:r>
               <w:rPr>
                 <w:rStyle w:val="Hyperlink"/>
@@ -1104,7 +1131,7 @@
                 <w:noProof/>
                 <w:webHidden/>
               </w:rPr>
-              <w:instrText xml:space="preserve"> PAGEREF _Toc241006673 \h </w:instrText>
+              <w:instrText xml:space="preserve"> PAGEREF _Toc241090975 \h </w:instrText>
             </w:r>
             <w:r>
               <w:rPr>
@@ -1125,6 +1152,882 @@
                 <w:webHidden/>
               </w:rPr>
               <w:t>- 8 -</w:t>
+            </w:r>
+            <w:r>
+              <w:rPr>
+                <w:noProof/>
+                <w:webHidden/>
+              </w:rPr>
+              <w:fldChar w:fldCharType="end"/>
+            </w:r>
+          </w:hyperlink>
+        </w:p>
+        <w:p>
+          <w:pPr>
+            <w:pStyle w:val="TOC2"/>
+            <w:tabs>
+              <w:tab w:val="right" w:pos="9350"/>
+            </w:tabs>
+            <w:rPr>
+              <w:rFonts w:cstheme="minorBidi"/>
+              <w:noProof/>
+              <w:kern w:val="2"/>
+              <w:sz w:val="24"/>
+              <w:szCs w:val="24"/>
+              <w14:ligatures w14:val="standardContextual"/>
+            </w:rPr>
+          </w:pPr>
+          <w:hyperlink w:anchor="_Toc241090976" w:history="1">
+            <w:r>
+              <w:rPr>
+                <w:rStyle w:val="Hyperlink"/>
+                <w:noProof/>
+              </w:rPr>
+              <w:t>NoSQL Injection (Authentication Bypass)</w:t>
+            </w:r>
+            <w:r>
+              <w:rPr>
+                <w:noProof/>
+                <w:webHidden/>
+              </w:rPr>
+              <w:tab/>
+            </w:r>
+            <w:r>
+              <w:rPr>
+                <w:noProof/>
+                <w:webHidden/>
+              </w:rPr>
+              <w:fldChar w:fldCharType="begin"/>
+            </w:r>
+            <w:r>
+              <w:rPr>
+                <w:noProof/>
+                <w:webHidden/>
+              </w:rPr>
+              <w:instrText xml:space="preserve"> PAGEREF _Toc241090976 \h </w:instrText>
+            </w:r>
+            <w:r>
+              <w:rPr>
+                <w:noProof/>
+                <w:webHidden/>
+              </w:rPr>
+            </w:r>
+            <w:r>
+              <w:rPr>
+                <w:noProof/>
+                <w:webHidden/>
+              </w:rPr>
+              <w:fldChar w:fldCharType="separate"/>
+            </w:r>
+            <w:r>
+              <w:rPr>
+                <w:noProof/>
+                <w:webHidden/>
+              </w:rPr>
+              <w:t>- 8 -</w:t>
+            </w:r>
+            <w:r>
+              <w:rPr>
+                <w:noProof/>
+                <w:webHidden/>
+              </w:rPr>
+              <w:fldChar w:fldCharType="end"/>
+            </w:r>
+          </w:hyperlink>
+        </w:p>
+        <w:p>
+          <w:pPr>
+            <w:pStyle w:val="TOC3"/>
+            <w:tabs>
+              <w:tab w:val="right" w:pos="9350"/>
+            </w:tabs>
+            <w:rPr>
+              <w:rFonts w:cstheme="minorBidi"/>
+              <w:noProof/>
+              <w:kern w:val="2"/>
+              <w:sz w:val="24"/>
+              <w:szCs w:val="24"/>
+              <w14:ligatures w14:val="standardContextual"/>
+            </w:rPr>
+          </w:pPr>
+          <w:hyperlink w:anchor="_Toc241090977" w:history="1">
+            <w:r>
+              <w:rPr>
+                <w:rStyle w:val="Hyperlink"/>
+                <w:noProof/>
+              </w:rPr>
+              <w:t>Vulnerability</w:t>
+            </w:r>
+            <w:r>
+              <w:rPr>
+                <w:noProof/>
+                <w:webHidden/>
+              </w:rPr>
+              <w:tab/>
+            </w:r>
+            <w:r>
+              <w:rPr>
+                <w:noProof/>
+                <w:webHidden/>
+              </w:rPr>
+              <w:fldChar w:fldCharType="begin"/>
+            </w:r>
+            <w:r>
+              <w:rPr>
+                <w:noProof/>
+                <w:webHidden/>
+              </w:rPr>
+              <w:instrText xml:space="preserve"> PAGEREF _Toc241090977 \h </w:instrText>
+            </w:r>
+            <w:r>
+              <w:rPr>
+                <w:noProof/>
+                <w:webHidden/>
+              </w:rPr>
+            </w:r>
+            <w:r>
+              <w:rPr>
+                <w:noProof/>
+                <w:webHidden/>
+              </w:rPr>
+              <w:fldChar w:fldCharType="separate"/>
+            </w:r>
+            <w:r>
+              <w:rPr>
+                <w:noProof/>
+                <w:webHidden/>
+              </w:rPr>
+              <w:t>- 8 -</w:t>
+            </w:r>
+            <w:r>
+              <w:rPr>
+                <w:noProof/>
+                <w:webHidden/>
+              </w:rPr>
+              <w:fldChar w:fldCharType="end"/>
+            </w:r>
+          </w:hyperlink>
+        </w:p>
+        <w:p>
+          <w:pPr>
+            <w:pStyle w:val="TOC3"/>
+            <w:tabs>
+              <w:tab w:val="right" w:pos="9350"/>
+            </w:tabs>
+            <w:rPr>
+              <w:rFonts w:cstheme="minorBidi"/>
+              <w:noProof/>
+              <w:kern w:val="2"/>
+              <w:sz w:val="24"/>
+              <w:szCs w:val="24"/>
+              <w14:ligatures w14:val="standardContextual"/>
+            </w:rPr>
+          </w:pPr>
+          <w:hyperlink w:anchor="_Toc241090978" w:history="1">
+            <w:r>
+              <w:rPr>
+                <w:rStyle w:val="Hyperlink"/>
+                <w:noProof/>
+              </w:rPr>
+              <w:t>Fix</w:t>
+            </w:r>
+            <w:r>
+              <w:rPr>
+                <w:noProof/>
+                <w:webHidden/>
+              </w:rPr>
+              <w:tab/>
+            </w:r>
+            <w:r>
+              <w:rPr>
+                <w:noProof/>
+                <w:webHidden/>
+              </w:rPr>
+              <w:fldChar w:fldCharType="begin"/>
+            </w:r>
+            <w:r>
+              <w:rPr>
+                <w:noProof/>
+                <w:webHidden/>
+              </w:rPr>
+              <w:instrText xml:space="preserve"> PAGEREF _Toc241090978 \h </w:instrText>
+            </w:r>
+            <w:r>
+              <w:rPr>
+                <w:noProof/>
+                <w:webHidden/>
+              </w:rPr>
+            </w:r>
+            <w:r>
+              <w:rPr>
+                <w:noProof/>
+                <w:webHidden/>
+              </w:rPr>
+              <w:fldChar w:fldCharType="separate"/>
+            </w:r>
+            <w:r>
+              <w:rPr>
+                <w:noProof/>
+                <w:webHidden/>
+              </w:rPr>
+              <w:t>- 9 -</w:t>
+            </w:r>
+            <w:r>
+              <w:rPr>
+                <w:noProof/>
+                <w:webHidden/>
+              </w:rPr>
+              <w:fldChar w:fldCharType="end"/>
+            </w:r>
+          </w:hyperlink>
+        </w:p>
+        <w:p>
+          <w:pPr>
+            <w:pStyle w:val="TOC2"/>
+            <w:tabs>
+              <w:tab w:val="right" w:pos="9350"/>
+            </w:tabs>
+            <w:rPr>
+              <w:rFonts w:cstheme="minorBidi"/>
+              <w:noProof/>
+              <w:kern w:val="2"/>
+              <w:sz w:val="24"/>
+              <w:szCs w:val="24"/>
+              <w14:ligatures w14:val="standardContextual"/>
+            </w:rPr>
+          </w:pPr>
+          <w:hyperlink w:anchor="_Toc241090979" w:history="1">
+            <w:r>
+              <w:rPr>
+                <w:rStyle w:val="Hyperlink"/>
+                <w:noProof/>
+              </w:rPr>
+              <w:t>Stored Cross-Site Scripting (XSS)</w:t>
+            </w:r>
+            <w:r>
+              <w:rPr>
+                <w:noProof/>
+                <w:webHidden/>
+              </w:rPr>
+              <w:tab/>
+            </w:r>
+            <w:r>
+              <w:rPr>
+                <w:noProof/>
+                <w:webHidden/>
+              </w:rPr>
+              <w:fldChar w:fldCharType="begin"/>
+            </w:r>
+            <w:r>
+              <w:rPr>
+                <w:noProof/>
+                <w:webHidden/>
+              </w:rPr>
+              <w:instrText xml:space="preserve"> PAGEREF _Toc241090979 \h </w:instrText>
+            </w:r>
+            <w:r>
+              <w:rPr>
+                <w:noProof/>
+                <w:webHidden/>
+              </w:rPr>
+            </w:r>
+            <w:r>
+              <w:rPr>
+                <w:noProof/>
+                <w:webHidden/>
+              </w:rPr>
+              <w:fldChar w:fldCharType="separate"/>
+            </w:r>
+            <w:r>
+              <w:rPr>
+                <w:noProof/>
+                <w:webHidden/>
+              </w:rPr>
+              <w:t>- 11 -</w:t>
+            </w:r>
+            <w:r>
+              <w:rPr>
+                <w:noProof/>
+                <w:webHidden/>
+              </w:rPr>
+              <w:fldChar w:fldCharType="end"/>
+            </w:r>
+          </w:hyperlink>
+        </w:p>
+        <w:p>
+          <w:pPr>
+            <w:pStyle w:val="TOC3"/>
+            <w:tabs>
+              <w:tab w:val="right" w:pos="9350"/>
+            </w:tabs>
+            <w:rPr>
+              <w:rFonts w:cstheme="minorBidi"/>
+              <w:noProof/>
+              <w:kern w:val="2"/>
+              <w:sz w:val="24"/>
+              <w:szCs w:val="24"/>
+              <w14:ligatures w14:val="standardContextual"/>
+            </w:rPr>
+          </w:pPr>
+          <w:hyperlink w:anchor="_Toc241090980" w:history="1">
+            <w:r>
+              <w:rPr>
+                <w:rStyle w:val="Hyperlink"/>
+                <w:noProof/>
+              </w:rPr>
+              <w:t>Vulnerability</w:t>
+            </w:r>
+            <w:r>
+              <w:rPr>
+                <w:noProof/>
+                <w:webHidden/>
+              </w:rPr>
+              <w:tab/>
+            </w:r>
+            <w:r>
+              <w:rPr>
+                <w:noProof/>
+                <w:webHidden/>
+              </w:rPr>
+              <w:fldChar w:fldCharType="begin"/>
+            </w:r>
+            <w:r>
+              <w:rPr>
+                <w:noProof/>
+                <w:webHidden/>
+              </w:rPr>
+              <w:instrText xml:space="preserve"> PAGEREF _Toc241090980 \h </w:instrText>
+            </w:r>
+            <w:r>
+              <w:rPr>
+                <w:noProof/>
+                <w:webHidden/>
+              </w:rPr>
+            </w:r>
+            <w:r>
+              <w:rPr>
+                <w:noProof/>
+                <w:webHidden/>
+              </w:rPr>
+              <w:fldChar w:fldCharType="separate"/>
+            </w:r>
+            <w:r>
+              <w:rPr>
+                <w:noProof/>
+                <w:webHidden/>
+              </w:rPr>
+              <w:t>- 11 -</w:t>
+            </w:r>
+            <w:r>
+              <w:rPr>
+                <w:noProof/>
+                <w:webHidden/>
+              </w:rPr>
+              <w:fldChar w:fldCharType="end"/>
+            </w:r>
+          </w:hyperlink>
+        </w:p>
+        <w:p>
+          <w:pPr>
+            <w:pStyle w:val="TOC3"/>
+            <w:tabs>
+              <w:tab w:val="right" w:pos="9350"/>
+            </w:tabs>
+            <w:rPr>
+              <w:rFonts w:cstheme="minorBidi"/>
+              <w:noProof/>
+              <w:kern w:val="2"/>
+              <w:sz w:val="24"/>
+              <w:szCs w:val="24"/>
+              <w14:ligatures w14:val="standardContextual"/>
+            </w:rPr>
+          </w:pPr>
+          <w:hyperlink w:anchor="_Toc241090981" w:history="1">
+            <w:r>
+              <w:rPr>
+                <w:rStyle w:val="Hyperlink"/>
+                <w:noProof/>
+              </w:rPr>
+              <w:t>Fix</w:t>
+            </w:r>
+            <w:r>
+              <w:rPr>
+                <w:noProof/>
+                <w:webHidden/>
+              </w:rPr>
+              <w:tab/>
+            </w:r>
+            <w:r>
+              <w:rPr>
+                <w:noProof/>
+                <w:webHidden/>
+              </w:rPr>
+              <w:fldChar w:fldCharType="begin"/>
+            </w:r>
+            <w:r>
+              <w:rPr>
+                <w:noProof/>
+                <w:webHidden/>
+              </w:rPr>
+              <w:instrText xml:space="preserve"> PAGEREF _Toc241090981 \h </w:instrText>
+            </w:r>
+            <w:r>
+              <w:rPr>
+                <w:noProof/>
+                <w:webHidden/>
+              </w:rPr>
+            </w:r>
+            <w:r>
+              <w:rPr>
+                <w:noProof/>
+                <w:webHidden/>
+              </w:rPr>
+              <w:fldChar w:fldCharType="separate"/>
+            </w:r>
+            <w:r>
+              <w:rPr>
+                <w:noProof/>
+                <w:webHidden/>
+              </w:rPr>
+              <w:t>- 12 -</w:t>
+            </w:r>
+            <w:r>
+              <w:rPr>
+                <w:noProof/>
+                <w:webHidden/>
+              </w:rPr>
+              <w:fldChar w:fldCharType="end"/>
+            </w:r>
+          </w:hyperlink>
+        </w:p>
+        <w:p>
+          <w:pPr>
+            <w:pStyle w:val="TOC2"/>
+            <w:tabs>
+              <w:tab w:val="right" w:pos="9350"/>
+            </w:tabs>
+            <w:rPr>
+              <w:rFonts w:cstheme="minorBidi"/>
+              <w:noProof/>
+              <w:kern w:val="2"/>
+              <w:sz w:val="24"/>
+              <w:szCs w:val="24"/>
+              <w14:ligatures w14:val="standardContextual"/>
+            </w:rPr>
+          </w:pPr>
+          <w:hyperlink w:anchor="_Toc241090982" w:history="1">
+            <w:r>
+              <w:rPr>
+                <w:rStyle w:val="Hyperlink"/>
+                <w:noProof/>
+              </w:rPr>
+              <w:t>Insecure Direct Object Reference (IDOR)</w:t>
+            </w:r>
+            <w:r>
+              <w:rPr>
+                <w:noProof/>
+                <w:webHidden/>
+              </w:rPr>
+              <w:tab/>
+            </w:r>
+            <w:r>
+              <w:rPr>
+                <w:noProof/>
+                <w:webHidden/>
+              </w:rPr>
+              <w:fldChar w:fldCharType="begin"/>
+            </w:r>
+            <w:r>
+              <w:rPr>
+                <w:noProof/>
+                <w:webHidden/>
+              </w:rPr>
+              <w:instrText xml:space="preserve"> PAGEREF _Toc241090982 \h </w:instrText>
+            </w:r>
+            <w:r>
+              <w:rPr>
+                <w:noProof/>
+                <w:webHidden/>
+              </w:rPr>
+            </w:r>
+            <w:r>
+              <w:rPr>
+                <w:noProof/>
+                <w:webHidden/>
+              </w:rPr>
+              <w:fldChar w:fldCharType="separate"/>
+            </w:r>
+            <w:r>
+              <w:rPr>
+                <w:noProof/>
+                <w:webHidden/>
+              </w:rPr>
+              <w:t>- 13 -</w:t>
+            </w:r>
+            <w:r>
+              <w:rPr>
+                <w:noProof/>
+                <w:webHidden/>
+              </w:rPr>
+              <w:fldChar w:fldCharType="end"/>
+            </w:r>
+          </w:hyperlink>
+        </w:p>
+        <w:p>
+          <w:pPr>
+            <w:pStyle w:val="TOC3"/>
+            <w:tabs>
+              <w:tab w:val="right" w:pos="9350"/>
+            </w:tabs>
+            <w:rPr>
+              <w:rFonts w:cstheme="minorBidi"/>
+              <w:noProof/>
+              <w:kern w:val="2"/>
+              <w:sz w:val="24"/>
+              <w:szCs w:val="24"/>
+              <w14:ligatures w14:val="standardContextual"/>
+            </w:rPr>
+          </w:pPr>
+          <w:hyperlink w:anchor="_Toc241090983" w:history="1">
+            <w:r>
+              <w:rPr>
+                <w:rStyle w:val="Hyperlink"/>
+                <w:noProof/>
+              </w:rPr>
+              <w:t>Vulnerabilities</w:t>
+            </w:r>
+            <w:r>
+              <w:rPr>
+                <w:noProof/>
+                <w:webHidden/>
+              </w:rPr>
+              <w:tab/>
+            </w:r>
+            <w:r>
+              <w:rPr>
+                <w:noProof/>
+                <w:webHidden/>
+              </w:rPr>
+              <w:fldChar w:fldCharType="begin"/>
+            </w:r>
+            <w:r>
+              <w:rPr>
+                <w:noProof/>
+                <w:webHidden/>
+              </w:rPr>
+              <w:instrText xml:space="preserve"> PAGEREF _Toc241090983 \h </w:instrText>
+            </w:r>
+            <w:r>
+              <w:rPr>
+                <w:noProof/>
+                <w:webHidden/>
+              </w:rPr>
+            </w:r>
+            <w:r>
+              <w:rPr>
+                <w:noProof/>
+                <w:webHidden/>
+              </w:rPr>
+              <w:fldChar w:fldCharType="separate"/>
+            </w:r>
+            <w:r>
+              <w:rPr>
+                <w:noProof/>
+                <w:webHidden/>
+              </w:rPr>
+              <w:t>- 13 -</w:t>
+            </w:r>
+            <w:r>
+              <w:rPr>
+                <w:noProof/>
+                <w:webHidden/>
+              </w:rPr>
+              <w:fldChar w:fldCharType="end"/>
+            </w:r>
+          </w:hyperlink>
+        </w:p>
+        <w:p>
+          <w:pPr>
+            <w:pStyle w:val="TOC3"/>
+            <w:tabs>
+              <w:tab w:val="right" w:pos="9350"/>
+            </w:tabs>
+            <w:rPr>
+              <w:rFonts w:cstheme="minorBidi"/>
+              <w:noProof/>
+              <w:kern w:val="2"/>
+              <w:sz w:val="24"/>
+              <w:szCs w:val="24"/>
+              <w14:ligatures w14:val="standardContextual"/>
+            </w:rPr>
+          </w:pPr>
+          <w:hyperlink w:anchor="_Toc241090984" w:history="1">
+            <w:r>
+              <w:rPr>
+                <w:rStyle w:val="Hyperlink"/>
+                <w:noProof/>
+              </w:rPr>
+              <w:t>Fix</w:t>
+            </w:r>
+            <w:r>
+              <w:rPr>
+                <w:noProof/>
+                <w:webHidden/>
+              </w:rPr>
+              <w:tab/>
+            </w:r>
+            <w:r>
+              <w:rPr>
+                <w:noProof/>
+                <w:webHidden/>
+              </w:rPr>
+              <w:fldChar w:fldCharType="begin"/>
+            </w:r>
+            <w:r>
+              <w:rPr>
+                <w:noProof/>
+                <w:webHidden/>
+              </w:rPr>
+              <w:instrText xml:space="preserve"> PAGEREF _Toc241090984 \h </w:instrText>
+            </w:r>
+            <w:r>
+              <w:rPr>
+                <w:noProof/>
+                <w:webHidden/>
+              </w:rPr>
+            </w:r>
+            <w:r>
+              <w:rPr>
+                <w:noProof/>
+                <w:webHidden/>
+              </w:rPr>
+              <w:fldChar w:fldCharType="separate"/>
+            </w:r>
+            <w:r>
+              <w:rPr>
+                <w:noProof/>
+                <w:webHidden/>
+              </w:rPr>
+              <w:t>- 14 -</w:t>
+            </w:r>
+            <w:r>
+              <w:rPr>
+                <w:noProof/>
+                <w:webHidden/>
+              </w:rPr>
+              <w:fldChar w:fldCharType="end"/>
+            </w:r>
+          </w:hyperlink>
+        </w:p>
+        <w:p>
+          <w:pPr>
+            <w:pStyle w:val="TOC2"/>
+            <w:tabs>
+              <w:tab w:val="right" w:pos="9350"/>
+            </w:tabs>
+            <w:rPr>
+              <w:rFonts w:cstheme="minorBidi"/>
+              <w:noProof/>
+              <w:kern w:val="2"/>
+              <w:sz w:val="24"/>
+              <w:szCs w:val="24"/>
+              <w14:ligatures w14:val="standardContextual"/>
+            </w:rPr>
+          </w:pPr>
+          <w:hyperlink w:anchor="_Toc241090985" w:history="1">
+            <w:r>
+              <w:rPr>
+                <w:rStyle w:val="Hyperlink"/>
+                <w:noProof/>
+              </w:rPr>
+              <w:t>Insecure Cryptographic Storage (Plaintext Passwords)</w:t>
+            </w:r>
+            <w:r>
+              <w:rPr>
+                <w:noProof/>
+                <w:webHidden/>
+              </w:rPr>
+              <w:tab/>
+            </w:r>
+            <w:r>
+              <w:rPr>
+                <w:noProof/>
+                <w:webHidden/>
+              </w:rPr>
+              <w:fldChar w:fldCharType="begin"/>
+            </w:r>
+            <w:r>
+              <w:rPr>
+                <w:noProof/>
+                <w:webHidden/>
+              </w:rPr>
+              <w:instrText xml:space="preserve"> PAGEREF _Toc241090985 \h </w:instrText>
+            </w:r>
+            <w:r>
+              <w:rPr>
+                <w:noProof/>
+                <w:webHidden/>
+              </w:rPr>
+            </w:r>
+            <w:r>
+              <w:rPr>
+                <w:noProof/>
+                <w:webHidden/>
+              </w:rPr>
+              <w:fldChar w:fldCharType="separate"/>
+            </w:r>
+            <w:r>
+              <w:rPr>
+                <w:noProof/>
+                <w:webHidden/>
+              </w:rPr>
+              <w:t>- 15 -</w:t>
+            </w:r>
+            <w:r>
+              <w:rPr>
+                <w:noProof/>
+                <w:webHidden/>
+              </w:rPr>
+              <w:fldChar w:fldCharType="end"/>
+            </w:r>
+          </w:hyperlink>
+        </w:p>
+        <w:p>
+          <w:pPr>
+            <w:pStyle w:val="TOC3"/>
+            <w:tabs>
+              <w:tab w:val="right" w:pos="9350"/>
+            </w:tabs>
+            <w:rPr>
+              <w:rFonts w:cstheme="minorBidi"/>
+              <w:noProof/>
+              <w:kern w:val="2"/>
+              <w:sz w:val="24"/>
+              <w:szCs w:val="24"/>
+              <w14:ligatures w14:val="standardContextual"/>
+            </w:rPr>
+          </w:pPr>
+          <w:hyperlink w:anchor="_Toc241090986" w:history="1">
+            <w:r>
+              <w:rPr>
+                <w:rStyle w:val="Hyperlink"/>
+                <w:noProof/>
+              </w:rPr>
+              <w:t>Vulnerable</w:t>
+            </w:r>
+            <w:r>
+              <w:rPr>
+                <w:noProof/>
+                <w:webHidden/>
+              </w:rPr>
+              <w:tab/>
+            </w:r>
+            <w:r>
+              <w:rPr>
+                <w:noProof/>
+                <w:webHidden/>
+              </w:rPr>
+              <w:fldChar w:fldCharType="begin"/>
+            </w:r>
+            <w:r>
+              <w:rPr>
+                <w:noProof/>
+                <w:webHidden/>
+              </w:rPr>
+              <w:instrText xml:space="preserve"> PAGEREF _Toc241090986 \h </w:instrText>
+            </w:r>
+            <w:r>
+              <w:rPr>
+                <w:noProof/>
+                <w:webHidden/>
+              </w:rPr>
+            </w:r>
+            <w:r>
+              <w:rPr>
+                <w:noProof/>
+                <w:webHidden/>
+              </w:rPr>
+              <w:fldChar w:fldCharType="separate"/>
+            </w:r>
+            <w:r>
+              <w:rPr>
+                <w:noProof/>
+                <w:webHidden/>
+              </w:rPr>
+              <w:t>- 15 -</w:t>
+            </w:r>
+            <w:r>
+              <w:rPr>
+                <w:noProof/>
+                <w:webHidden/>
+              </w:rPr>
+              <w:fldChar w:fldCharType="end"/>
+            </w:r>
+          </w:hyperlink>
+        </w:p>
+        <w:p>
+          <w:pPr>
+            <w:pStyle w:val="TOC3"/>
+            <w:tabs>
+              <w:tab w:val="right" w:pos="9350"/>
+            </w:tabs>
+            <w:rPr>
+              <w:rFonts w:cstheme="minorBidi"/>
+              <w:noProof/>
+              <w:kern w:val="2"/>
+              <w:sz w:val="24"/>
+              <w:szCs w:val="24"/>
+              <w14:ligatures w14:val="standardContextual"/>
+            </w:rPr>
+          </w:pPr>
+          <w:hyperlink w:anchor="_Toc241090987" w:history="1">
+            <w:r>
+              <w:rPr>
+                <w:rStyle w:val="Hyperlink"/>
+                <w:noProof/>
+              </w:rPr>
+              <w:t>Fix</w:t>
+            </w:r>
+            <w:r>
+              <w:rPr>
+                <w:noProof/>
+                <w:webHidden/>
+              </w:rPr>
+              <w:tab/>
+            </w:r>
+            <w:r>
+              <w:rPr>
+                <w:noProof/>
+                <w:webHidden/>
+              </w:rPr>
+              <w:fldChar w:fldCharType="begin"/>
+            </w:r>
+            <w:r>
+              <w:rPr>
+                <w:noProof/>
+                <w:webHidden/>
+              </w:rPr>
+              <w:instrText xml:space="preserve"> PAGEREF _Toc241090987 \h </w:instrText>
+            </w:r>
+            <w:r>
+              <w:rPr>
+                <w:noProof/>
+                <w:webHidden/>
+              </w:rPr>
+            </w:r>
+            <w:r>
+              <w:rPr>
+                <w:noProof/>
+                <w:webHidden/>
+              </w:rPr>
+              <w:fldChar w:fldCharType="separate"/>
+            </w:r>
+            <w:r>
+              <w:rPr>
+                <w:noProof/>
+                <w:webHidden/>
+              </w:rPr>
+              <w:t>- 17 -</w:t>
             </w:r>
             <w:r>
               <w:rPr>
@@ -1163,7 +2066,7 @@
           <w:bCs/>
         </w:rPr>
       </w:pPr>
-      <w:bookmarkStart w:id="0" w:name="_Toc241006665"/>
+      <w:bookmarkStart w:id="0" w:name="_Toc241090967"/>
       <w:r>
         <w:rPr>
           <w:b/>
@@ -1178,15 +2081,28 @@
       <w:pPr>
         <w:pStyle w:val="Heading2"/>
       </w:pPr>
-      <w:bookmarkStart w:id="1" w:name="_Toc241006666"/>
-      <w:r>
-        <w:t>Multiocintainer stack</w:t>
+      <w:bookmarkStart w:id="1" w:name="_Toc241090968"/>
+      <w:proofErr w:type="spellStart"/>
+      <w:r>
+        <w:t>Multiocintainer</w:t>
+      </w:r>
+      <w:proofErr w:type="spellEnd"/>
+      <w:r>
+        <w:t xml:space="preserve"> stack</w:t>
       </w:r>
       <w:bookmarkEnd w:id="1"/>
     </w:p>
     <w:p>
       <w:r>
-        <w:t xml:space="preserve">The deployment architecture partitions OWASP NodeGoat into two discrete containerized tiers </w:t>
+        <w:t xml:space="preserve">The deployment architecture partitions OWASP </w:t>
+      </w:r>
+      <w:proofErr w:type="spellStart"/>
+      <w:r>
+        <w:t>NodeGoat</w:t>
+      </w:r>
+      <w:proofErr w:type="spellEnd"/>
+      <w:r>
+        <w:t xml:space="preserve"> into two discrete containerized tiers </w:t>
       </w:r>
     </w:p>
     <w:p>
@@ -1198,7 +2114,15 @@
         </w:numPr>
       </w:pPr>
       <w:r>
-        <w:t>The application runtime tier(nodegoat-web)</w:t>
+        <w:t>The application runtime tier(</w:t>
+      </w:r>
+      <w:proofErr w:type="spellStart"/>
+      <w:r>
+        <w:t>nodegoat</w:t>
+      </w:r>
+      <w:proofErr w:type="spellEnd"/>
+      <w:r>
+        <w:t>-web)</w:t>
       </w:r>
     </w:p>
     <w:p>
@@ -1210,12 +2134,36 @@
         </w:numPr>
       </w:pPr>
       <w:r>
-        <w:t>Data storage tier(nodegoat-db)</w:t>
-      </w:r>
-    </w:p>
-    <w:p>
-      <w:r>
-        <w:t xml:space="preserve">Using docker compose the system build and start in fully self container offline status single command </w:t>
+        <w:t xml:space="preserve">Data storage </w:t>
+      </w:r>
+      <w:proofErr w:type="gramStart"/>
+      <w:r>
+        <w:t>tier</w:t>
+      </w:r>
+      <w:proofErr w:type="gramEnd"/>
+      <w:r>
+        <w:t>(</w:t>
+      </w:r>
+      <w:proofErr w:type="spellStart"/>
+      <w:r>
+        <w:t>nodegoat-db</w:t>
+      </w:r>
+      <w:proofErr w:type="spellEnd"/>
+      <w:r>
+        <w:t>)</w:t>
+      </w:r>
+    </w:p>
+    <w:p>
+      <w:r>
+        <w:t xml:space="preserve">Using docker compose the system build and start in fully </w:t>
+      </w:r>
+      <w:proofErr w:type="spellStart"/>
+      <w:r>
+        <w:t>self container</w:t>
+      </w:r>
+      <w:proofErr w:type="spellEnd"/>
+      <w:r>
+        <w:t xml:space="preserve"> offline status single command </w:t>
       </w:r>
       <w:r>
         <w:rPr>
@@ -1225,14 +2173,46 @@
         <w:t xml:space="preserve">docker compose up –build. </w:t>
       </w:r>
       <w:r>
-        <w:t>The web container  manage express application handling and isolated mongo-db database management manage in db docker using tcp port 27017 for monitoring scripts and logs</w:t>
+        <w:t xml:space="preserve">The web </w:t>
+      </w:r>
+      <w:proofErr w:type="gramStart"/>
+      <w:r>
+        <w:t>container  manage</w:t>
+      </w:r>
+      <w:proofErr w:type="gramEnd"/>
+      <w:r>
+        <w:t xml:space="preserve"> express application handling and isolated mongo-</w:t>
+      </w:r>
+      <w:proofErr w:type="spellStart"/>
+      <w:r>
+        <w:t>db</w:t>
+      </w:r>
+      <w:proofErr w:type="spellEnd"/>
+      <w:r>
+        <w:t xml:space="preserve"> database management manage in </w:t>
+      </w:r>
+      <w:proofErr w:type="spellStart"/>
+      <w:r>
+        <w:t>db</w:t>
+      </w:r>
+      <w:proofErr w:type="spellEnd"/>
+      <w:r>
+        <w:t xml:space="preserve"> docker using </w:t>
+      </w:r>
+      <w:proofErr w:type="spellStart"/>
+      <w:r>
+        <w:t>tcp</w:t>
+      </w:r>
+      <w:proofErr w:type="spellEnd"/>
+      <w:r>
+        <w:t xml:space="preserve"> port 27017 for monitoring scripts and logs</w:t>
       </w:r>
     </w:p>
     <w:p>
       <w:pPr>
         <w:pStyle w:val="Heading2"/>
       </w:pPr>
-      <w:bookmarkStart w:id="2" w:name="_Toc241006667"/>
+      <w:bookmarkStart w:id="2" w:name="_Toc241090969"/>
       <w:r>
         <w:t>Container hardening and principle of least privilege</w:t>
       </w:r>
@@ -1242,8 +2222,13 @@
       <w:r>
         <w:t xml:space="preserve">To mitigate container </w:t>
       </w:r>
-      <w:r>
-        <w:t>brake down</w:t>
+      <w:proofErr w:type="gramStart"/>
+      <w:r>
+        <w:t>brake</w:t>
+      </w:r>
+      <w:proofErr w:type="gramEnd"/>
+      <w:r>
+        <w:t xml:space="preserve"> down</w:t>
       </w:r>
       <w:r>
         <w:t xml:space="preserve"> and privilege escalation risks the application container explicitly </w:t>
@@ -1258,7 +2243,15 @@
         <w:t>Docker file</w:t>
       </w:r>
       <w:r>
-        <w:t xml:space="preserve"> apply </w:t>
+        <w:t xml:space="preserve"> </w:t>
+      </w:r>
+      <w:proofErr w:type="gramStart"/>
+      <w:r>
+        <w:t>apply</w:t>
+      </w:r>
+      <w:proofErr w:type="gramEnd"/>
+      <w:r>
+        <w:t xml:space="preserve"> </w:t>
       </w:r>
       <w:r>
         <w:t>user mode</w:t>
@@ -1274,7 +2267,7 @@
       <w:pPr>
         <w:pStyle w:val="Heading2"/>
       </w:pPr>
-      <w:bookmarkStart w:id="3" w:name="_Toc241006668"/>
+      <w:bookmarkStart w:id="3" w:name="_Toc241090970"/>
       <w:r>
         <w:t xml:space="preserve">Network segmentation and trust </w:t>
       </w:r>
@@ -1355,6 +2348,8 @@
       <w:r>
         <w:t xml:space="preserve">configure with </w:t>
       </w:r>
+      <w:proofErr w:type="spellStart"/>
+      <w:proofErr w:type="gramStart"/>
       <w:r>
         <w:rPr>
           <w:b/>
@@ -1362,6 +2357,8 @@
         </w:rPr>
         <w:t>internal:true</w:t>
       </w:r>
+      <w:proofErr w:type="spellEnd"/>
+      <w:proofErr w:type="gramEnd"/>
       <w:r>
         <w:t xml:space="preserve"> to </w:t>
       </w:r>
@@ -1577,7 +2574,7 @@
           <w:bCs/>
         </w:rPr>
       </w:pPr>
-      <w:bookmarkStart w:id="4" w:name="_Toc241006669"/>
+      <w:bookmarkStart w:id="4" w:name="_Toc241090971"/>
       <w:r>
         <w:rPr>
           <w:b/>
@@ -1592,7 +2589,7 @@
       <w:pPr>
         <w:pStyle w:val="Heading2"/>
       </w:pPr>
-      <w:bookmarkStart w:id="5" w:name="_Toc241006670"/>
+      <w:bookmarkStart w:id="5" w:name="_Toc241090972"/>
       <w:r>
         <w:t>S</w:t>
       </w:r>
@@ -1606,7 +2603,20 @@
     </w:p>
     <w:p>
       <w:r>
-        <w:t>Below are four realistic, application-specific threats that might target the NodeGoat architecture. The threats were identified using the STRIDE methodology.</w:t>
+        <w:t xml:space="preserve">Below are four realistic, application-specific threats that might target </w:t>
+      </w:r>
+      <w:proofErr w:type="gramStart"/>
+      <w:r>
+        <w:t xml:space="preserve">the </w:t>
+      </w:r>
+      <w:proofErr w:type="spellStart"/>
+      <w:r>
+        <w:t>NodeGoat</w:t>
+      </w:r>
+      <w:proofErr w:type="spellEnd"/>
+      <w:proofErr w:type="gramEnd"/>
+      <w:r>
+        <w:t xml:space="preserve"> architecture. The threats were identified using the STRIDE methodology.</w:t>
       </w:r>
     </w:p>
     <w:p>
@@ -1630,7 +2640,39 @@
         <w:pStyle w:val="ListParagraph"/>
       </w:pPr>
       <w:r>
-        <w:t xml:space="preserve"> An attacker can launch a NoSQL injection attack by sending a malicious JSON object to the /login API. By replacing the password value with a MongoDB operator, such as {"password": {"$ne": null}}, and taking advantage of the fact that Express does not enforce typechecking on the input, the attacker can bypass authentication and hijack an administrator’s session. No credentials would be required to perform this attack, apart from basic knowledge of the MongoDB query language.</w:t>
+        <w:t xml:space="preserve"> An attacker can launch a NoSQL injection attack by sending a malicious JSON object to the /login API. By replacing the password value with a MongoDB operator, such </w:t>
+      </w:r>
+      <w:proofErr w:type="gramStart"/>
+      <w:r>
+        <w:t>as {"</w:t>
+      </w:r>
+      <w:proofErr w:type="gramEnd"/>
+      <w:r>
+        <w:t>password</w:t>
+      </w:r>
+      <w:proofErr w:type="gramStart"/>
+      <w:r>
+        <w:t>": {</w:t>
+      </w:r>
+      <w:proofErr w:type="gramEnd"/>
+      <w:r>
+        <w:t>"$ne": null}</w:t>
+      </w:r>
+      <w:proofErr w:type="gramStart"/>
+      <w:r>
+        <w:t>}, and</w:t>
+      </w:r>
+      <w:proofErr w:type="gramEnd"/>
+      <w:r>
+        <w:t xml:space="preserve"> taking advantage of the fact that Express does not enforce </w:t>
+      </w:r>
+      <w:proofErr w:type="spellStart"/>
+      <w:r>
+        <w:t>typechecking</w:t>
+      </w:r>
+      <w:proofErr w:type="spellEnd"/>
+      <w:r>
+        <w:t xml:space="preserve"> on the input, the attacker can bypass authentication and hijack an administrator’s session. No credentials would be required to perform this attack, apart from basic knowledge of the MongoDB query language.</w:t>
       </w:r>
     </w:p>
     <w:p>
@@ -1649,7 +2691,23 @@
         <w:t>Tampering (Insecure Direct Object Reference on Allocations):</w:t>
       </w:r>
       <w:r>
-        <w:t xml:space="preserve"> An authenticated attacker can tamper with allocation records by modifying the request sent to the server when the attacker attempts to update their asset allocation. By changing the userId value in the request to another value, the attacker can effectively change the allocation records of another user. The vulnerability stems from the fact that the server does not check whether the userId belongs to the authenticated attacker.</w:t>
+        <w:t xml:space="preserve"> An authenticated attacker can tamper with allocation records by modifying the request sent to the server when the attacker attempts to update their asset allocation. By changing the </w:t>
+      </w:r>
+      <w:proofErr w:type="spellStart"/>
+      <w:r>
+        <w:t>userId</w:t>
+      </w:r>
+      <w:proofErr w:type="spellEnd"/>
+      <w:r>
+        <w:t xml:space="preserve"> value in the request to another value, the attacker can effectively change the allocation records of another user. The vulnerability stems from the fact that the server does not check whether the </w:t>
+      </w:r>
+      <w:proofErr w:type="spellStart"/>
+      <w:r>
+        <w:t>userId</w:t>
+      </w:r>
+      <w:proofErr w:type="spellEnd"/>
+      <w:r>
+        <w:t xml:space="preserve"> belongs to the authenticated attacker.</w:t>
       </w:r>
     </w:p>
     <w:p>
@@ -1668,7 +2726,15 @@
         <w:t>Information Disclosure (Hardcoded Database Credentials):</w:t>
       </w:r>
       <w:r>
-        <w:t xml:space="preserve"> A developer could accidentally commit the database credentials required to connect to the MongoDB server and sign cookies for the Express framework in the config/env/development.js file or the docker-compose.yml file. If this information becomes available to an attacker, they can utilize it to connect to the database directly and forge valid session cookies to hijack the administrator’s session.</w:t>
+        <w:t xml:space="preserve"> A developer could accidentally commit the database credentials required to connect to the MongoDB server and sign cookies for the Express framework in the config/env/development.js file or the docker-</w:t>
+      </w:r>
+      <w:proofErr w:type="spellStart"/>
+      <w:r>
+        <w:t>compose.yml</w:t>
+      </w:r>
+      <w:proofErr w:type="spellEnd"/>
+      <w:r>
+        <w:t xml:space="preserve"> file. If this information becomes available to an attacker, they can utilize it to connect to the database directly and forge valid session cookies to hijack the administrator’s session.</w:t>
       </w:r>
     </w:p>
     <w:p>
@@ -1699,7 +2765,7 @@
       <w:pPr>
         <w:pStyle w:val="Heading2"/>
       </w:pPr>
-      <w:bookmarkStart w:id="6" w:name="_Toc241006671"/>
+      <w:bookmarkStart w:id="6" w:name="_Toc241090973"/>
       <w:r>
         <w:lastRenderedPageBreak/>
         <w:t>Risk evaluation matrix</w:t>
@@ -1710,6 +2776,7 @@
       <w:r>
         <w:t xml:space="preserve">Each thread is scored on a5x5 matrix evaluating </w:t>
       </w:r>
+      <w:proofErr w:type="gramStart"/>
       <w:r>
         <w:rPr>
           <w:b/>
@@ -1717,6 +2784,7 @@
         </w:rPr>
         <w:t>likelihood(</w:t>
       </w:r>
+      <w:proofErr w:type="gramEnd"/>
       <w:r>
         <w:t>how easy/often the attack can be executed</w:t>
       </w:r>
@@ -1810,8 +2878,13 @@
             <w:tcW w:w="2337" w:type="dxa"/>
           </w:tcPr>
           <w:p>
-            <w:r>
-              <w:t>Spoofing(login no SQLi)</w:t>
+            <w:proofErr w:type="gramStart"/>
+            <w:r>
+              <w:t>Spoofing(</w:t>
+            </w:r>
+            <w:proofErr w:type="gramEnd"/>
+            <w:r>
+              <w:t>login no SQLi)</w:t>
             </w:r>
           </w:p>
         </w:tc>
@@ -1852,8 +2925,13 @@
             <w:tcW w:w="2337" w:type="dxa"/>
           </w:tcPr>
           <w:p>
-            <w:r>
-              <w:t>Tempering(allocation IDOR)</w:t>
+            <w:proofErr w:type="gramStart"/>
+            <w:r>
+              <w:t>Tempering(</w:t>
+            </w:r>
+            <w:proofErr w:type="gramEnd"/>
+            <w:r>
+              <w:t>allocation IDOR)</w:t>
             </w:r>
           </w:p>
         </w:tc>
@@ -1895,7 +2973,15 @@
           </w:tcPr>
           <w:p>
             <w:r>
-              <w:t>Info disclosure(secrets in G</w:t>
+              <w:t xml:space="preserve">Info </w:t>
+            </w:r>
+            <w:proofErr w:type="gramStart"/>
+            <w:r>
+              <w:t>disclosure(</w:t>
+            </w:r>
+            <w:proofErr w:type="gramEnd"/>
+            <w:r>
+              <w:t>secrets in G</w:t>
             </w:r>
             <w:r>
               <w:t>i</w:t>
@@ -1942,9 +3028,11 @@
             <w:tcW w:w="2337" w:type="dxa"/>
           </w:tcPr>
           <w:p>
+            <w:proofErr w:type="gramStart"/>
             <w:r>
               <w:t>Dos(</w:t>
             </w:r>
+            <w:proofErr w:type="gramEnd"/>
             <w:r>
               <w:t>Payload</w:t>
             </w:r>
@@ -1990,7 +3078,7 @@
       <w:pPr>
         <w:pStyle w:val="Heading2"/>
       </w:pPr>
-      <w:bookmarkStart w:id="7" w:name="_Toc241006672"/>
+      <w:bookmarkStart w:id="7" w:name="_Toc241090974"/>
       <w:r>
         <w:t>Thread to control mapping</w:t>
       </w:r>
@@ -1998,7 +3086,15 @@
     </w:p>
     <w:p>
       <w:r>
-        <w:t>This table directly identified threats to the specific security controls implemented in pipeline and codebase</w:t>
+        <w:t xml:space="preserve">This table directly </w:t>
+      </w:r>
+      <w:proofErr w:type="gramStart"/>
+      <w:r>
+        <w:t>identified</w:t>
+      </w:r>
+      <w:proofErr w:type="gramEnd"/>
+      <w:r>
+        <w:t xml:space="preserve"> threats to the specific security controls implemented in pipeline and codebase</w:t>
       </w:r>
     </w:p>
     <w:tbl>
@@ -2112,12 +3208,23 @@
             <w:r>
               <w:t xml:space="preserve"> Implement strict allow-list type checking (</w:t>
             </w:r>
+            <w:proofErr w:type="spellStart"/>
+            <w:proofErr w:type="gramStart"/>
             <w:r>
               <w:rPr>
                 <w:b/>
                 <w:bCs/>
               </w:rPr>
-              <w:t>typeof password === 'string'</w:t>
+              <w:t>typeof</w:t>
+            </w:r>
+            <w:proofErr w:type="spellEnd"/>
+            <w:proofErr w:type="gramEnd"/>
+            <w:r>
+              <w:rPr>
+                <w:b/>
+                <w:bCs/>
+              </w:rPr>
+              <w:t xml:space="preserve"> password === 'string'</w:t>
             </w:r>
             <w:r>
               <w:t>) before querying the database.</w:t>
@@ -2206,8 +3313,26 @@
                 <w:b/>
                 <w:bCs/>
               </w:rPr>
-              <w:t xml:space="preserve"> req.session.userId</w:t>
-            </w:r>
+              <w:t xml:space="preserve"> </w:t>
+            </w:r>
+            <w:proofErr w:type="spellStart"/>
+            <w:proofErr w:type="gramStart"/>
+            <w:r>
+              <w:rPr>
+                <w:b/>
+                <w:bCs/>
+              </w:rPr>
+              <w:t>req.session</w:t>
+            </w:r>
+            <w:proofErr w:type="gramEnd"/>
+            <w:r>
+              <w:rPr>
+                <w:b/>
+                <w:bCs/>
+              </w:rPr>
+              <w:t>.userId</w:t>
+            </w:r>
+            <w:proofErr w:type="spellEnd"/>
           </w:p>
         </w:tc>
         <w:tc>
@@ -2276,7 +3401,15 @@
               <w:t>Secret Scanning &amp; Environment Injection:</w:t>
             </w:r>
             <w:r>
-              <w:t xml:space="preserve"> Gitleaks prevents secret commits, and GitHub Actions Encrypted Secrets inject credentials at runtime</w:t>
+              <w:t xml:space="preserve"> Gitleaks prevents secret </w:t>
+            </w:r>
+            <w:proofErr w:type="gramStart"/>
+            <w:r>
+              <w:t>commits</w:t>
+            </w:r>
+            <w:proofErr w:type="gramEnd"/>
+            <w:r>
+              <w:t>, and GitHub Actions Encrypted Secrets inject credentials at runtime</w:t>
             </w:r>
           </w:p>
         </w:tc>
@@ -2296,8 +3429,33 @@
                 <w:b/>
                 <w:bCs/>
               </w:rPr>
-              <w:t>.github/workflows/devsecops-pipeline.yml</w:t>
-            </w:r>
+              <w:t>.</w:t>
+            </w:r>
+            <w:proofErr w:type="spellStart"/>
+            <w:r>
+              <w:rPr>
+                <w:b/>
+                <w:bCs/>
+              </w:rPr>
+              <w:t>github</w:t>
+            </w:r>
+            <w:proofErr w:type="spellEnd"/>
+            <w:r>
+              <w:rPr>
+                <w:b/>
+                <w:bCs/>
+              </w:rPr>
+              <w:t>/workflows/</w:t>
+            </w:r>
+            <w:proofErr w:type="spellStart"/>
+            <w:r>
+              <w:rPr>
+                <w:b/>
+                <w:bCs/>
+              </w:rPr>
+              <w:t>devsecops-pipeline.yml</w:t>
+            </w:r>
+            <w:proofErr w:type="spellEnd"/>
           </w:p>
         </w:tc>
       </w:tr>
@@ -2345,14 +3503,56 @@
               <w:t>SAST &amp; Infrastructure Hardening</w:t>
             </w:r>
             <w:r>
-              <w:t xml:space="preserve">: Semgrep flags missing limits; </w:t>
-            </w:r>
+              <w:t xml:space="preserve">: </w:t>
+            </w:r>
+            <w:proofErr w:type="spellStart"/>
+            <w:r>
+              <w:t>Semgrep</w:t>
+            </w:r>
+            <w:proofErr w:type="spellEnd"/>
+            <w:r>
+              <w:t xml:space="preserve"> flags missing limits; </w:t>
+            </w:r>
+            <w:proofErr w:type="spellStart"/>
+            <w:proofErr w:type="gramStart"/>
             <w:r>
               <w:rPr>
                 <w:b/>
                 <w:bCs/>
               </w:rPr>
-              <w:t>express.json({ limit: '10kb' })</w:t>
+              <w:t>express.json</w:t>
+            </w:r>
+            <w:proofErr w:type="spellEnd"/>
+            <w:r>
+              <w:rPr>
+                <w:b/>
+                <w:bCs/>
+              </w:rPr>
+              <w:t>({ limit</w:t>
+            </w:r>
+            <w:proofErr w:type="gramEnd"/>
+            <w:r>
+              <w:rPr>
+                <w:b/>
+                <w:bCs/>
+              </w:rPr>
+              <w:t>: '10kb</w:t>
+            </w:r>
+            <w:proofErr w:type="gramStart"/>
+            <w:r>
+              <w:rPr>
+                <w:b/>
+                <w:bCs/>
+              </w:rPr>
+              <w:t>' }</w:t>
+            </w:r>
+            <w:proofErr w:type="gramEnd"/>
+            <w:r>
+              <w:rPr>
+                <w:b/>
+                <w:bCs/>
+              </w:rPr>
+              <w:t>)</w:t>
             </w:r>
             <w:r>
               <w:t xml:space="preserve"> restricts body size.</w:t>
@@ -2375,8 +3575,33 @@
                 <w:b/>
                 <w:bCs/>
               </w:rPr>
-              <w:t>.github/workflows/devsecops-pipeline.yml</w:t>
-            </w:r>
+              <w:t>.</w:t>
+            </w:r>
+            <w:proofErr w:type="spellStart"/>
+            <w:r>
+              <w:rPr>
+                <w:b/>
+                <w:bCs/>
+              </w:rPr>
+              <w:t>github</w:t>
+            </w:r>
+            <w:proofErr w:type="spellEnd"/>
+            <w:r>
+              <w:rPr>
+                <w:b/>
+                <w:bCs/>
+              </w:rPr>
+              <w:t>/workflows/</w:t>
+            </w:r>
+            <w:proofErr w:type="spellStart"/>
+            <w:r>
+              <w:rPr>
+                <w:b/>
+                <w:bCs/>
+              </w:rPr>
+              <w:t>devsecops-pipeline.yml</w:t>
+            </w:r>
+            <w:proofErr w:type="spellEnd"/>
           </w:p>
         </w:tc>
       </w:tr>
@@ -2395,7 +3620,7 @@
           <w:bCs/>
         </w:rPr>
       </w:pPr>
-      <w:bookmarkStart w:id="8" w:name="_Toc241006673"/>
+      <w:bookmarkStart w:id="8" w:name="_Toc241090975"/>
       <w:r>
         <w:rPr>
           <w:b/>
@@ -2410,17 +3635,21 @@
       <w:pPr>
         <w:pStyle w:val="Heading2"/>
       </w:pPr>
+      <w:bookmarkStart w:id="9" w:name="_Toc241090976"/>
       <w:r>
         <w:t>NoSQL Injection (Authentication Bypass)</w:t>
       </w:r>
+      <w:bookmarkEnd w:id="9"/>
     </w:p>
     <w:p>
       <w:pPr>
         <w:pStyle w:val="Heading3"/>
       </w:pPr>
+      <w:bookmarkStart w:id="10" w:name="_Toc241090977"/>
       <w:r>
         <w:t>Vulnerability</w:t>
       </w:r>
+      <w:bookmarkEnd w:id="10"/>
     </w:p>
     <w:p>
       <w:r>
@@ -2623,9 +3852,11 @@
       <w:pPr>
         <w:pStyle w:val="Heading3"/>
       </w:pPr>
+      <w:bookmarkStart w:id="11" w:name="_Toc241090978"/>
       <w:r>
         <w:t>Fix</w:t>
       </w:r>
+      <w:bookmarkEnd w:id="11"/>
     </w:p>
     <w:p>
       <w:r>
@@ -2757,18 +3988,22 @@
       <w:pPr>
         <w:pStyle w:val="Heading2"/>
       </w:pPr>
+      <w:bookmarkStart w:id="12" w:name="_Toc241090979"/>
       <w:r>
         <w:lastRenderedPageBreak/>
         <w:t>Stored Cross-Site Scripting (XSS)</w:t>
       </w:r>
+      <w:bookmarkEnd w:id="12"/>
     </w:p>
     <w:p>
       <w:pPr>
         <w:pStyle w:val="Heading3"/>
       </w:pPr>
+      <w:bookmarkStart w:id="13" w:name="_Toc241090980"/>
       <w:r>
         <w:t>Vulnerability</w:t>
       </w:r>
+      <w:bookmarkEnd w:id="13"/>
     </w:p>
     <w:p>
       <w:r>
@@ -2903,9 +4138,11 @@
       <w:pPr>
         <w:pStyle w:val="Heading3"/>
       </w:pPr>
+      <w:bookmarkStart w:id="14" w:name="_Toc241090981"/>
       <w:r>
         <w:t>Fix</w:t>
       </w:r>
+      <w:bookmarkEnd w:id="14"/>
     </w:p>
     <w:p>
       <w:r>
@@ -3018,17 +4255,21 @@
       <w:pPr>
         <w:pStyle w:val="Heading2"/>
       </w:pPr>
+      <w:bookmarkStart w:id="15" w:name="_Toc241090982"/>
       <w:r>
         <w:t>Insecure Direct Object Reference (IDOR)</w:t>
       </w:r>
+      <w:bookmarkEnd w:id="15"/>
     </w:p>
     <w:p>
       <w:pPr>
         <w:pStyle w:val="Heading3"/>
       </w:pPr>
+      <w:bookmarkStart w:id="16" w:name="_Toc241090983"/>
       <w:r>
         <w:t>Vulnerabilities</w:t>
       </w:r>
+      <w:bookmarkEnd w:id="16"/>
     </w:p>
     <w:p>
       <w:r>
@@ -3160,9 +4401,11 @@
       <w:pPr>
         <w:pStyle w:val="Heading3"/>
       </w:pPr>
+      <w:bookmarkStart w:id="17" w:name="_Toc241090984"/>
       <w:r>
         <w:t>Fix</w:t>
       </w:r>
+      <w:bookmarkEnd w:id="17"/>
     </w:p>
     <w:p/>
     <w:p/>
@@ -3257,12 +4500,286 @@
       <w:pPr>
         <w:pStyle w:val="Heading2"/>
       </w:pPr>
+      <w:bookmarkStart w:id="18" w:name="_Toc241090985"/>
       <w:r>
         <w:t>Insecure Cryptographic Storage (Plaintext Passwords)</w:t>
       </w:r>
+      <w:bookmarkEnd w:id="18"/>
+    </w:p>
+    <w:p>
+      <w:pPr>
+        <w:pStyle w:val="Heading3"/>
+      </w:pPr>
+      <w:bookmarkStart w:id="19" w:name="_Toc241090986"/>
+      <w:r>
+        <w:t>Vulnerable</w:t>
+      </w:r>
+      <w:bookmarkEnd w:id="19"/>
+    </w:p>
+    <w:p>
+      <w:r>
+        <w:rPr>
+          <w:b/>
+          <w:bCs/>
+        </w:rPr>
+        <w:drawing>
+          <wp:inline distT="0" distB="0" distL="0" distR="0" wp14:anchorId="14EB85FE" wp14:editId="759121A0">
+            <wp:extent cx="5943600" cy="2070100"/>
+            <wp:effectExtent l="0" t="0" r="0" b="6350"/>
+            <wp:docPr id="129184653" name="Picture 1"/>
+            <wp:cNvGraphicFramePr>
+              <a:graphicFrameLocks xmlns:a="http://schemas.openxmlformats.org/drawingml/2006/main" noChangeAspect="1"/>
+            </wp:cNvGraphicFramePr>
+            <a:graphic xmlns:a="http://schemas.openxmlformats.org/drawingml/2006/main">
+              <a:graphicData uri="http://schemas.openxmlformats.org/drawingml/2006/picture">
+                <pic:pic xmlns:pic="http://schemas.openxmlformats.org/drawingml/2006/picture">
+                  <pic:nvPicPr>
+                    <pic:cNvPr id="129184653" name=""/>
+                    <pic:cNvPicPr/>
+                  </pic:nvPicPr>
+                  <pic:blipFill>
+                    <a:blip r:embed="rId32"/>
+                    <a:stretch>
+                      <a:fillRect/>
+                    </a:stretch>
+                  </pic:blipFill>
+                  <pic:spPr>
+                    <a:xfrm>
+                      <a:off x="0" y="0"/>
+                      <a:ext cx="5943600" cy="2070100"/>
+                    </a:xfrm>
+                    <a:prstGeom prst="rect">
+                      <a:avLst/>
+                    </a:prstGeom>
+                  </pic:spPr>
+                </pic:pic>
+              </a:graphicData>
+            </a:graphic>
+          </wp:inline>
+        </w:drawing>
+      </w:r>
+    </w:p>
+    <w:p>
+      <w:r>
+        <w:t>app/data/user-dao.js</w:t>
+      </w:r>
+    </w:p>
+    <w:p>
+      <w:r>
+        <w:lastRenderedPageBreak/>
+        <w:drawing>
+          <wp:inline distT="0" distB="0" distL="0" distR="0" wp14:anchorId="6F444330" wp14:editId="2209982B">
+            <wp:extent cx="5943600" cy="1742440"/>
+            <wp:effectExtent l="0" t="0" r="0" b="0"/>
+            <wp:docPr id="1905454104" name="Picture 1"/>
+            <wp:cNvGraphicFramePr>
+              <a:graphicFrameLocks xmlns:a="http://schemas.openxmlformats.org/drawingml/2006/main" noChangeAspect="1"/>
+            </wp:cNvGraphicFramePr>
+            <a:graphic xmlns:a="http://schemas.openxmlformats.org/drawingml/2006/main">
+              <a:graphicData uri="http://schemas.openxmlformats.org/drawingml/2006/picture">
+                <pic:pic xmlns:pic="http://schemas.openxmlformats.org/drawingml/2006/picture">
+                  <pic:nvPicPr>
+                    <pic:cNvPr id="1905454104" name=""/>
+                    <pic:cNvPicPr/>
+                  </pic:nvPicPr>
+                  <pic:blipFill>
+                    <a:blip r:embed="rId33"/>
+                    <a:stretch>
+                      <a:fillRect/>
+                    </a:stretch>
+                  </pic:blipFill>
+                  <pic:spPr>
+                    <a:xfrm>
+                      <a:off x="0" y="0"/>
+                      <a:ext cx="5943600" cy="1742440"/>
+                    </a:xfrm>
+                    <a:prstGeom prst="rect">
+                      <a:avLst/>
+                    </a:prstGeom>
+                  </pic:spPr>
+                </pic:pic>
+              </a:graphicData>
+            </a:graphic>
+          </wp:inline>
+        </w:drawing>
+      </w:r>
+    </w:p>
+    <w:p>
+      <w:r>
+        <w:drawing>
+          <wp:inline distT="0" distB="0" distL="0" distR="0" wp14:anchorId="028A4E49" wp14:editId="476E4A96">
+            <wp:extent cx="5943600" cy="4603115"/>
+            <wp:effectExtent l="0" t="0" r="0" b="6985"/>
+            <wp:docPr id="1370542150" name="Picture 1"/>
+            <wp:cNvGraphicFramePr>
+              <a:graphicFrameLocks xmlns:a="http://schemas.openxmlformats.org/drawingml/2006/main" noChangeAspect="1"/>
+            </wp:cNvGraphicFramePr>
+            <a:graphic xmlns:a="http://schemas.openxmlformats.org/drawingml/2006/main">
+              <a:graphicData uri="http://schemas.openxmlformats.org/drawingml/2006/picture">
+                <pic:pic xmlns:pic="http://schemas.openxmlformats.org/drawingml/2006/picture">
+                  <pic:nvPicPr>
+                    <pic:cNvPr id="1370542150" name=""/>
+                    <pic:cNvPicPr/>
+                  </pic:nvPicPr>
+                  <pic:blipFill>
+                    <a:blip r:embed="rId34"/>
+                    <a:stretch>
+                      <a:fillRect/>
+                    </a:stretch>
+                  </pic:blipFill>
+                  <pic:spPr>
+                    <a:xfrm>
+                      <a:off x="0" y="0"/>
+                      <a:ext cx="5943600" cy="4603115"/>
+                    </a:xfrm>
+                    <a:prstGeom prst="rect">
+                      <a:avLst/>
+                    </a:prstGeom>
+                  </pic:spPr>
+                </pic:pic>
+              </a:graphicData>
+            </a:graphic>
+          </wp:inline>
+        </w:drawing>
+      </w:r>
+    </w:p>
+    <w:p>
+      <w:pPr>
+        <w:pStyle w:val="Heading3"/>
+      </w:pPr>
+      <w:bookmarkStart w:id="20" w:name="_Toc241090987"/>
+      <w:r>
+        <w:lastRenderedPageBreak/>
+        <w:t>Fix</w:t>
+      </w:r>
+      <w:bookmarkEnd w:id="20"/>
+    </w:p>
+    <w:p>
+      <w:r>
+        <w:drawing>
+          <wp:inline distT="0" distB="0" distL="0" distR="0" wp14:anchorId="1F32CA28" wp14:editId="021A2E03">
+            <wp:extent cx="5943600" cy="1546860"/>
+            <wp:effectExtent l="0" t="0" r="0" b="0"/>
+            <wp:docPr id="993794482" name="Picture 1"/>
+            <wp:cNvGraphicFramePr>
+              <a:graphicFrameLocks xmlns:a="http://schemas.openxmlformats.org/drawingml/2006/main" noChangeAspect="1"/>
+            </wp:cNvGraphicFramePr>
+            <a:graphic xmlns:a="http://schemas.openxmlformats.org/drawingml/2006/main">
+              <a:graphicData uri="http://schemas.openxmlformats.org/drawingml/2006/picture">
+                <pic:pic xmlns:pic="http://schemas.openxmlformats.org/drawingml/2006/picture">
+                  <pic:nvPicPr>
+                    <pic:cNvPr id="993794482" name=""/>
+                    <pic:cNvPicPr/>
+                  </pic:nvPicPr>
+                  <pic:blipFill>
+                    <a:blip r:embed="rId35"/>
+                    <a:stretch>
+                      <a:fillRect/>
+                    </a:stretch>
+                  </pic:blipFill>
+                  <pic:spPr>
+                    <a:xfrm>
+                      <a:off x="0" y="0"/>
+                      <a:ext cx="5943600" cy="1546860"/>
+                    </a:xfrm>
+                    <a:prstGeom prst="rect">
+                      <a:avLst/>
+                    </a:prstGeom>
+                  </pic:spPr>
+                </pic:pic>
+              </a:graphicData>
+            </a:graphic>
+          </wp:inline>
+        </w:drawing>
+      </w:r>
+    </w:p>
+    <w:p>
+      <w:r>
+        <w:t>app/data/user-dao.js</w:t>
+      </w:r>
+    </w:p>
+    <w:p>
+      <w:r>
+        <w:drawing>
+          <wp:inline distT="0" distB="0" distL="0" distR="0" wp14:anchorId="0C1C785A" wp14:editId="170E41C1">
+            <wp:extent cx="5943600" cy="2470785"/>
+            <wp:effectExtent l="0" t="0" r="0" b="5715"/>
+            <wp:docPr id="42679197" name="Picture 1"/>
+            <wp:cNvGraphicFramePr>
+              <a:graphicFrameLocks xmlns:a="http://schemas.openxmlformats.org/drawingml/2006/main" noChangeAspect="1"/>
+            </wp:cNvGraphicFramePr>
+            <a:graphic xmlns:a="http://schemas.openxmlformats.org/drawingml/2006/main">
+              <a:graphicData uri="http://schemas.openxmlformats.org/drawingml/2006/picture">
+                <pic:pic xmlns:pic="http://schemas.openxmlformats.org/drawingml/2006/picture">
+                  <pic:nvPicPr>
+                    <pic:cNvPr id="42679197" name=""/>
+                    <pic:cNvPicPr/>
+                  </pic:nvPicPr>
+                  <pic:blipFill>
+                    <a:blip r:embed="rId36"/>
+                    <a:stretch>
+                      <a:fillRect/>
+                    </a:stretch>
+                  </pic:blipFill>
+                  <pic:spPr>
+                    <a:xfrm>
+                      <a:off x="0" y="0"/>
+                      <a:ext cx="5943600" cy="2470785"/>
+                    </a:xfrm>
+                    <a:prstGeom prst="rect">
+                      <a:avLst/>
+                    </a:prstGeom>
+                  </pic:spPr>
+                </pic:pic>
+              </a:graphicData>
+            </a:graphic>
+          </wp:inline>
+        </w:drawing>
+      </w:r>
+    </w:p>
+    <w:p/>
+    <w:p>
+      <w:r>
+        <w:lastRenderedPageBreak/>
+        <w:drawing>
+          <wp:inline distT="0" distB="0" distL="0" distR="0" wp14:anchorId="527575F2" wp14:editId="5EC1E383">
+            <wp:extent cx="5943600" cy="4208780"/>
+            <wp:effectExtent l="0" t="0" r="0" b="1270"/>
+            <wp:docPr id="959898642" name="Picture 1"/>
+            <wp:cNvGraphicFramePr>
+              <a:graphicFrameLocks xmlns:a="http://schemas.openxmlformats.org/drawingml/2006/main" noChangeAspect="1"/>
+            </wp:cNvGraphicFramePr>
+            <a:graphic xmlns:a="http://schemas.openxmlformats.org/drawingml/2006/main">
+              <a:graphicData uri="http://schemas.openxmlformats.org/drawingml/2006/picture">
+                <pic:pic xmlns:pic="http://schemas.openxmlformats.org/drawingml/2006/picture">
+                  <pic:nvPicPr>
+                    <pic:cNvPr id="959898642" name=""/>
+                    <pic:cNvPicPr/>
+                  </pic:nvPicPr>
+                  <pic:blipFill>
+                    <a:blip r:embed="rId37"/>
+                    <a:stretch>
+                      <a:fillRect/>
+                    </a:stretch>
+                  </pic:blipFill>
+                  <pic:spPr>
+                    <a:xfrm>
+                      <a:off x="0" y="0"/>
+                      <a:ext cx="5943600" cy="4208780"/>
+                    </a:xfrm>
+                    <a:prstGeom prst="rect">
+                      <a:avLst/>
+                    </a:prstGeom>
+                  </pic:spPr>
+                </pic:pic>
+              </a:graphicData>
+            </a:graphic>
+          </wp:inline>
+        </w:drawing>
+      </w:r>
     </w:p>
     <w:sectPr>
-      <w:footerReference w:type="default" r:id="rId32"/>
+      <w:footerReference w:type="default" r:id="rId38"/>
       <w:pgSz w:w="12240" w:h="15840"/>
       <w:pgMar w:top="1440" w:right="1440" w:bottom="1440" w:left="1440" w:header="720" w:footer="720" w:gutter="0"/>
       <w:pgNumType w:fmt="numberInDash" w:start="1"/>
@@ -4273,7 +5790,7 @@
   <w:style w:type="paragraph" w:default="1" w:styleId="Normal">
     <w:name w:val="Normal"/>
     <w:qFormat/>
-    <w:rsid w:val="00CB56FD"/>
+    <w:rsid w:val="00E77C48"/>
   </w:style>
   <w:style w:type="paragraph" w:styleId="Heading1">
     <w:name w:val="heading 1"/>

</xml_diff>